<commit_message>
Updated the microservice notes
</commit_message>
<xml_diff>
--- a/microservices/Microservice Question.docx
+++ b/microservices/Microservice Question.docx
@@ -59,7 +59,7 @@
           <w:r>
             <w:fldChar w:fldCharType="separate"/>
           </w:r>
-          <w:hyperlink w:anchor="_Toc207569865" w:history="1">
+          <w:hyperlink w:anchor="_Toc209962398" w:history="1">
             <w:r>
               <w:rPr>
                 <w:rStyle w:val="Hyperlink"/>
@@ -103,7 +103,7 @@
                 <w:noProof/>
                 <w:webHidden/>
               </w:rPr>
-              <w:instrText xml:space="preserve"> PAGEREF _Toc207569865 \h </w:instrText>
+              <w:instrText xml:space="preserve"> PAGEREF _Toc209962398 \h </w:instrText>
             </w:r>
             <w:r>
               <w:rPr>
@@ -149,7 +149,7 @@
               <w:lang w:eastAsia="en-IN"/>
             </w:rPr>
           </w:pPr>
-          <w:hyperlink w:anchor="_Toc207569866" w:history="1">
+          <w:hyperlink w:anchor="_Toc209962399" w:history="1">
             <w:r>
               <w:rPr>
                 <w:rStyle w:val="Hyperlink"/>
@@ -193,7 +193,7 @@
                 <w:noProof/>
                 <w:webHidden/>
               </w:rPr>
-              <w:instrText xml:space="preserve"> PAGEREF _Toc207569866 \h </w:instrText>
+              <w:instrText xml:space="preserve"> PAGEREF _Toc209962399 \h </w:instrText>
             </w:r>
             <w:r>
               <w:rPr>
@@ -239,7 +239,7 @@
               <w:lang w:eastAsia="en-IN"/>
             </w:rPr>
           </w:pPr>
-          <w:hyperlink w:anchor="_Toc207569867" w:history="1">
+          <w:hyperlink w:anchor="_Toc209962400" w:history="1">
             <w:r>
               <w:rPr>
                 <w:rStyle w:val="Hyperlink"/>
@@ -283,7 +283,7 @@
                 <w:noProof/>
                 <w:webHidden/>
               </w:rPr>
-              <w:instrText xml:space="preserve"> PAGEREF _Toc207569867 \h </w:instrText>
+              <w:instrText xml:space="preserve"> PAGEREF _Toc209962400 \h </w:instrText>
             </w:r>
             <w:r>
               <w:rPr>
@@ -329,7 +329,7 @@
               <w:lang w:eastAsia="en-IN"/>
             </w:rPr>
           </w:pPr>
-          <w:hyperlink w:anchor="_Toc207569868" w:history="1">
+          <w:hyperlink w:anchor="_Toc209962401" w:history="1">
             <w:r>
               <w:rPr>
                 <w:rStyle w:val="Hyperlink"/>
@@ -373,7 +373,7 @@
                 <w:noProof/>
                 <w:webHidden/>
               </w:rPr>
-              <w:instrText xml:space="preserve"> PAGEREF _Toc207569868 \h </w:instrText>
+              <w:instrText xml:space="preserve"> PAGEREF _Toc209962401 \h </w:instrText>
             </w:r>
             <w:r>
               <w:rPr>
@@ -419,7 +419,7 @@
               <w:lang w:eastAsia="en-IN"/>
             </w:rPr>
           </w:pPr>
-          <w:hyperlink w:anchor="_Toc207569869" w:history="1">
+          <w:hyperlink w:anchor="_Toc209962402" w:history="1">
             <w:r>
               <w:rPr>
                 <w:rStyle w:val="Hyperlink"/>
@@ -463,7 +463,7 @@
                 <w:noProof/>
                 <w:webHidden/>
               </w:rPr>
-              <w:instrText xml:space="preserve"> PAGEREF _Toc207569869 \h </w:instrText>
+              <w:instrText xml:space="preserve"> PAGEREF _Toc209962402 \h </w:instrText>
             </w:r>
             <w:r>
               <w:rPr>
@@ -509,7 +509,7 @@
               <w:lang w:eastAsia="en-IN"/>
             </w:rPr>
           </w:pPr>
-          <w:hyperlink w:anchor="_Toc207569870" w:history="1">
+          <w:hyperlink w:anchor="_Toc209962403" w:history="1">
             <w:r>
               <w:rPr>
                 <w:rStyle w:val="Hyperlink"/>
@@ -553,7 +553,7 @@
                 <w:noProof/>
                 <w:webHidden/>
               </w:rPr>
-              <w:instrText xml:space="preserve"> PAGEREF _Toc207569870 \h </w:instrText>
+              <w:instrText xml:space="preserve"> PAGEREF _Toc209962403 \h </w:instrText>
             </w:r>
             <w:r>
               <w:rPr>
@@ -599,7 +599,7 @@
               <w:lang w:eastAsia="en-IN"/>
             </w:rPr>
           </w:pPr>
-          <w:hyperlink w:anchor="_Toc207569871" w:history="1">
+          <w:hyperlink w:anchor="_Toc209962404" w:history="1">
             <w:r>
               <w:rPr>
                 <w:rStyle w:val="Hyperlink"/>
@@ -643,7 +643,7 @@
                 <w:noProof/>
                 <w:webHidden/>
               </w:rPr>
-              <w:instrText xml:space="preserve"> PAGEREF _Toc207569871 \h </w:instrText>
+              <w:instrText xml:space="preserve"> PAGEREF _Toc209962404 \h </w:instrText>
             </w:r>
             <w:r>
               <w:rPr>
@@ -689,7 +689,7 @@
               <w:lang w:eastAsia="en-IN"/>
             </w:rPr>
           </w:pPr>
-          <w:hyperlink w:anchor="_Toc207569872" w:history="1">
+          <w:hyperlink w:anchor="_Toc209962405" w:history="1">
             <w:r>
               <w:rPr>
                 <w:rStyle w:val="Hyperlink"/>
@@ -733,7 +733,7 @@
                 <w:noProof/>
                 <w:webHidden/>
               </w:rPr>
-              <w:instrText xml:space="preserve"> PAGEREF _Toc207569872 \h </w:instrText>
+              <w:instrText xml:space="preserve"> PAGEREF _Toc209962405 \h </w:instrText>
             </w:r>
             <w:r>
               <w:rPr>
@@ -779,7 +779,7 @@
               <w:lang w:eastAsia="en-IN"/>
             </w:rPr>
           </w:pPr>
-          <w:hyperlink w:anchor="_Toc207569873" w:history="1">
+          <w:hyperlink w:anchor="_Toc209962406" w:history="1">
             <w:r>
               <w:rPr>
                 <w:rStyle w:val="Hyperlink"/>
@@ -823,7 +823,7 @@
                 <w:noProof/>
                 <w:webHidden/>
               </w:rPr>
-              <w:instrText xml:space="preserve"> PAGEREF _Toc207569873 \h </w:instrText>
+              <w:instrText xml:space="preserve"> PAGEREF _Toc209962406 \h </w:instrText>
             </w:r>
             <w:r>
               <w:rPr>
@@ -869,7 +869,7 @@
               <w:lang w:eastAsia="en-IN"/>
             </w:rPr>
           </w:pPr>
-          <w:hyperlink w:anchor="_Toc207569874" w:history="1">
+          <w:hyperlink w:anchor="_Toc209962407" w:history="1">
             <w:r>
               <w:rPr>
                 <w:rStyle w:val="Hyperlink"/>
@@ -913,7 +913,7 @@
                 <w:noProof/>
                 <w:webHidden/>
               </w:rPr>
-              <w:instrText xml:space="preserve"> PAGEREF _Toc207569874 \h </w:instrText>
+              <w:instrText xml:space="preserve"> PAGEREF _Toc209962407 \h </w:instrText>
             </w:r>
             <w:r>
               <w:rPr>
@@ -959,7 +959,7 @@
               <w:lang w:eastAsia="en-IN"/>
             </w:rPr>
           </w:pPr>
-          <w:hyperlink w:anchor="_Toc207569875" w:history="1">
+          <w:hyperlink w:anchor="_Toc209962408" w:history="1">
             <w:r>
               <w:rPr>
                 <w:rStyle w:val="Hyperlink"/>
@@ -1003,7 +1003,7 @@
                 <w:noProof/>
                 <w:webHidden/>
               </w:rPr>
-              <w:instrText xml:space="preserve"> PAGEREF _Toc207569875 \h </w:instrText>
+              <w:instrText xml:space="preserve"> PAGEREF _Toc209962408 \h </w:instrText>
             </w:r>
             <w:r>
               <w:rPr>
@@ -1049,7 +1049,7 @@
               <w:lang w:eastAsia="en-IN"/>
             </w:rPr>
           </w:pPr>
-          <w:hyperlink w:anchor="_Toc207569876" w:history="1">
+          <w:hyperlink w:anchor="_Toc209962409" w:history="1">
             <w:r>
               <w:rPr>
                 <w:rStyle w:val="Hyperlink"/>
@@ -1093,7 +1093,7 @@
                 <w:noProof/>
                 <w:webHidden/>
               </w:rPr>
-              <w:instrText xml:space="preserve"> PAGEREF _Toc207569876 \h </w:instrText>
+              <w:instrText xml:space="preserve"> PAGEREF _Toc209962409 \h </w:instrText>
             </w:r>
             <w:r>
               <w:rPr>
@@ -1139,7 +1139,7 @@
               <w:lang w:eastAsia="en-IN"/>
             </w:rPr>
           </w:pPr>
-          <w:hyperlink w:anchor="_Toc207569877" w:history="1">
+          <w:hyperlink w:anchor="_Toc209962410" w:history="1">
             <w:r>
               <w:rPr>
                 <w:rStyle w:val="Hyperlink"/>
@@ -1183,7 +1183,7 @@
                 <w:noProof/>
                 <w:webHidden/>
               </w:rPr>
-              <w:instrText xml:space="preserve"> PAGEREF _Toc207569877 \h </w:instrText>
+              <w:instrText xml:space="preserve"> PAGEREF _Toc209962410 \h </w:instrText>
             </w:r>
             <w:r>
               <w:rPr>
@@ -1229,7 +1229,7 @@
               <w:lang w:eastAsia="en-IN"/>
             </w:rPr>
           </w:pPr>
-          <w:hyperlink w:anchor="_Toc207569878" w:history="1">
+          <w:hyperlink w:anchor="_Toc209962411" w:history="1">
             <w:r>
               <w:rPr>
                 <w:rStyle w:val="Hyperlink"/>
@@ -1273,7 +1273,7 @@
                 <w:noProof/>
                 <w:webHidden/>
               </w:rPr>
-              <w:instrText xml:space="preserve"> PAGEREF _Toc207569878 \h </w:instrText>
+              <w:instrText xml:space="preserve"> PAGEREF _Toc209962411 \h </w:instrText>
             </w:r>
             <w:r>
               <w:rPr>
@@ -1319,7 +1319,7 @@
               <w:lang w:eastAsia="en-IN"/>
             </w:rPr>
           </w:pPr>
-          <w:hyperlink w:anchor="_Toc207569879" w:history="1">
+          <w:hyperlink w:anchor="_Toc209962412" w:history="1">
             <w:r>
               <w:rPr>
                 <w:rStyle w:val="Hyperlink"/>
@@ -1363,7 +1363,7 @@
                 <w:noProof/>
                 <w:webHidden/>
               </w:rPr>
-              <w:instrText xml:space="preserve"> PAGEREF _Toc207569879 \h </w:instrText>
+              <w:instrText xml:space="preserve"> PAGEREF _Toc209962412 \h </w:instrText>
             </w:r>
             <w:r>
               <w:rPr>
@@ -1409,7 +1409,7 @@
               <w:lang w:eastAsia="en-IN"/>
             </w:rPr>
           </w:pPr>
-          <w:hyperlink w:anchor="_Toc207569880" w:history="1">
+          <w:hyperlink w:anchor="_Toc209962413" w:history="1">
             <w:r>
               <w:rPr>
                 <w:rStyle w:val="Hyperlink"/>
@@ -1453,7 +1453,7 @@
                 <w:noProof/>
                 <w:webHidden/>
               </w:rPr>
-              <w:instrText xml:space="preserve"> PAGEREF _Toc207569880 \h </w:instrText>
+              <w:instrText xml:space="preserve"> PAGEREF _Toc209962413 \h </w:instrText>
             </w:r>
             <w:r>
               <w:rPr>
@@ -1499,7 +1499,7 @@
               <w:lang w:eastAsia="en-IN"/>
             </w:rPr>
           </w:pPr>
-          <w:hyperlink w:anchor="_Toc207569881" w:history="1">
+          <w:hyperlink w:anchor="_Toc209962414" w:history="1">
             <w:r>
               <w:rPr>
                 <w:rStyle w:val="Hyperlink"/>
@@ -1543,7 +1543,7 @@
                 <w:noProof/>
                 <w:webHidden/>
               </w:rPr>
-              <w:instrText xml:space="preserve"> PAGEREF _Toc207569881 \h </w:instrText>
+              <w:instrText xml:space="preserve"> PAGEREF _Toc209962414 \h </w:instrText>
             </w:r>
             <w:r>
               <w:rPr>
@@ -1589,7 +1589,7 @@
               <w:lang w:eastAsia="en-IN"/>
             </w:rPr>
           </w:pPr>
-          <w:hyperlink w:anchor="_Toc207569882" w:history="1">
+          <w:hyperlink w:anchor="_Toc209962415" w:history="1">
             <w:r>
               <w:rPr>
                 <w:rStyle w:val="Hyperlink"/>
@@ -1633,7 +1633,7 @@
                 <w:noProof/>
                 <w:webHidden/>
               </w:rPr>
-              <w:instrText xml:space="preserve"> PAGEREF _Toc207569882 \h </w:instrText>
+              <w:instrText xml:space="preserve"> PAGEREF _Toc209962415 \h </w:instrText>
             </w:r>
             <w:r>
               <w:rPr>
@@ -1679,7 +1679,7 @@
               <w:lang w:eastAsia="en-IN"/>
             </w:rPr>
           </w:pPr>
-          <w:hyperlink w:anchor="_Toc207569883" w:history="1">
+          <w:hyperlink w:anchor="_Toc209962416" w:history="1">
             <w:r>
               <w:rPr>
                 <w:rStyle w:val="Hyperlink"/>
@@ -1723,7 +1723,7 @@
                 <w:noProof/>
                 <w:webHidden/>
               </w:rPr>
-              <w:instrText xml:space="preserve"> PAGEREF _Toc207569883 \h </w:instrText>
+              <w:instrText xml:space="preserve"> PAGEREF _Toc209962416 \h </w:instrText>
             </w:r>
             <w:r>
               <w:rPr>
@@ -1769,7 +1769,7 @@
               <w:lang w:eastAsia="en-IN"/>
             </w:rPr>
           </w:pPr>
-          <w:hyperlink w:anchor="_Toc207569884" w:history="1">
+          <w:hyperlink w:anchor="_Toc209962417" w:history="1">
             <w:r>
               <w:rPr>
                 <w:rStyle w:val="Hyperlink"/>
@@ -1813,7 +1813,7 @@
                 <w:noProof/>
                 <w:webHidden/>
               </w:rPr>
-              <w:instrText xml:space="preserve"> PAGEREF _Toc207569884 \h </w:instrText>
+              <w:instrText xml:space="preserve"> PAGEREF _Toc209962417 \h </w:instrText>
             </w:r>
             <w:r>
               <w:rPr>
@@ -1859,7 +1859,7 @@
               <w:lang w:eastAsia="en-IN"/>
             </w:rPr>
           </w:pPr>
-          <w:hyperlink w:anchor="_Toc207569885" w:history="1">
+          <w:hyperlink w:anchor="_Toc209962418" w:history="1">
             <w:r>
               <w:rPr>
                 <w:rStyle w:val="Hyperlink"/>
@@ -1903,7 +1903,7 @@
                 <w:noProof/>
                 <w:webHidden/>
               </w:rPr>
-              <w:instrText xml:space="preserve"> PAGEREF _Toc207569885 \h </w:instrText>
+              <w:instrText xml:space="preserve"> PAGEREF _Toc209962418 \h </w:instrText>
             </w:r>
             <w:r>
               <w:rPr>
@@ -1924,6 +1924,276 @@
                 <w:webHidden/>
               </w:rPr>
               <w:t>13</w:t>
+            </w:r>
+            <w:r>
+              <w:rPr>
+                <w:noProof/>
+                <w:webHidden/>
+              </w:rPr>
+              <w:fldChar w:fldCharType="end"/>
+            </w:r>
+          </w:hyperlink>
+        </w:p>
+        <w:p>
+          <w:pPr>
+            <w:pStyle w:val="TOC2"/>
+            <w:tabs>
+              <w:tab w:val="left" w:pos="960"/>
+              <w:tab w:val="right" w:leader="dot" w:pos="10456"/>
+            </w:tabs>
+            <w:rPr>
+              <w:rFonts w:eastAsiaTheme="minorEastAsia"/>
+              <w:noProof/>
+              <w:sz w:val="24"/>
+              <w:szCs w:val="24"/>
+              <w:lang w:eastAsia="en-IN"/>
+            </w:rPr>
+          </w:pPr>
+          <w:hyperlink w:anchor="_Toc209962419" w:history="1">
+            <w:r>
+              <w:rPr>
+                <w:rStyle w:val="Hyperlink"/>
+                <w:noProof/>
+              </w:rPr>
+              <w:t>22.</w:t>
+            </w:r>
+            <w:r>
+              <w:rPr>
+                <w:rFonts w:eastAsiaTheme="minorEastAsia"/>
+                <w:noProof/>
+                <w:sz w:val="24"/>
+                <w:szCs w:val="24"/>
+                <w:lang w:eastAsia="en-IN"/>
+              </w:rPr>
+              <w:tab/>
+            </w:r>
+            <w:r>
+              <w:rPr>
+                <w:rStyle w:val="Hyperlink"/>
+                <w:noProof/>
+              </w:rPr>
+              <w:t>What is the serverless architecture?</w:t>
+            </w:r>
+            <w:r>
+              <w:rPr>
+                <w:noProof/>
+                <w:webHidden/>
+              </w:rPr>
+              <w:tab/>
+            </w:r>
+            <w:r>
+              <w:rPr>
+                <w:noProof/>
+                <w:webHidden/>
+              </w:rPr>
+              <w:fldChar w:fldCharType="begin"/>
+            </w:r>
+            <w:r>
+              <w:rPr>
+                <w:noProof/>
+                <w:webHidden/>
+              </w:rPr>
+              <w:instrText xml:space="preserve"> PAGEREF _Toc209962419 \h </w:instrText>
+            </w:r>
+            <w:r>
+              <w:rPr>
+                <w:noProof/>
+                <w:webHidden/>
+              </w:rPr>
+            </w:r>
+            <w:r>
+              <w:rPr>
+                <w:noProof/>
+                <w:webHidden/>
+              </w:rPr>
+              <w:fldChar w:fldCharType="separate"/>
+            </w:r>
+            <w:r>
+              <w:rPr>
+                <w:noProof/>
+                <w:webHidden/>
+              </w:rPr>
+              <w:t>14</w:t>
+            </w:r>
+            <w:r>
+              <w:rPr>
+                <w:noProof/>
+                <w:webHidden/>
+              </w:rPr>
+              <w:fldChar w:fldCharType="end"/>
+            </w:r>
+          </w:hyperlink>
+        </w:p>
+        <w:p>
+          <w:pPr>
+            <w:pStyle w:val="TOC2"/>
+            <w:tabs>
+              <w:tab w:val="left" w:pos="960"/>
+              <w:tab w:val="right" w:leader="dot" w:pos="10456"/>
+            </w:tabs>
+            <w:rPr>
+              <w:rFonts w:eastAsiaTheme="minorEastAsia"/>
+              <w:noProof/>
+              <w:sz w:val="24"/>
+              <w:szCs w:val="24"/>
+              <w:lang w:eastAsia="en-IN"/>
+            </w:rPr>
+          </w:pPr>
+          <w:hyperlink w:anchor="_Toc209962420" w:history="1">
+            <w:r>
+              <w:rPr>
+                <w:rStyle w:val="Hyperlink"/>
+                <w:noProof/>
+              </w:rPr>
+              <w:t>23.</w:t>
+            </w:r>
+            <w:r>
+              <w:rPr>
+                <w:rFonts w:eastAsiaTheme="minorEastAsia"/>
+                <w:noProof/>
+                <w:sz w:val="24"/>
+                <w:szCs w:val="24"/>
+                <w:lang w:eastAsia="en-IN"/>
+              </w:rPr>
+              <w:tab/>
+            </w:r>
+            <w:r>
+              <w:rPr>
+                <w:rStyle w:val="Hyperlink"/>
+                <w:noProof/>
+              </w:rPr>
+              <w:t>Difference between the monolithic, microservice and serverless architecture</w:t>
+            </w:r>
+            <w:r>
+              <w:rPr>
+                <w:noProof/>
+                <w:webHidden/>
+              </w:rPr>
+              <w:tab/>
+            </w:r>
+            <w:r>
+              <w:rPr>
+                <w:noProof/>
+                <w:webHidden/>
+              </w:rPr>
+              <w:fldChar w:fldCharType="begin"/>
+            </w:r>
+            <w:r>
+              <w:rPr>
+                <w:noProof/>
+                <w:webHidden/>
+              </w:rPr>
+              <w:instrText xml:space="preserve"> PAGEREF _Toc209962420 \h </w:instrText>
+            </w:r>
+            <w:r>
+              <w:rPr>
+                <w:noProof/>
+                <w:webHidden/>
+              </w:rPr>
+            </w:r>
+            <w:r>
+              <w:rPr>
+                <w:noProof/>
+                <w:webHidden/>
+              </w:rPr>
+              <w:fldChar w:fldCharType="separate"/>
+            </w:r>
+            <w:r>
+              <w:rPr>
+                <w:noProof/>
+                <w:webHidden/>
+              </w:rPr>
+              <w:t>14</w:t>
+            </w:r>
+            <w:r>
+              <w:rPr>
+                <w:noProof/>
+                <w:webHidden/>
+              </w:rPr>
+              <w:fldChar w:fldCharType="end"/>
+            </w:r>
+          </w:hyperlink>
+        </w:p>
+        <w:p>
+          <w:pPr>
+            <w:pStyle w:val="TOC2"/>
+            <w:tabs>
+              <w:tab w:val="left" w:pos="960"/>
+              <w:tab w:val="right" w:leader="dot" w:pos="10456"/>
+            </w:tabs>
+            <w:rPr>
+              <w:rFonts w:eastAsiaTheme="minorEastAsia"/>
+              <w:noProof/>
+              <w:sz w:val="24"/>
+              <w:szCs w:val="24"/>
+              <w:lang w:eastAsia="en-IN"/>
+            </w:rPr>
+          </w:pPr>
+          <w:hyperlink w:anchor="_Toc209962421" w:history="1">
+            <w:r>
+              <w:rPr>
+                <w:rStyle w:val="Hyperlink"/>
+                <w:noProof/>
+              </w:rPr>
+              <w:t>24.</w:t>
+            </w:r>
+            <w:r>
+              <w:rPr>
+                <w:rFonts w:eastAsiaTheme="minorEastAsia"/>
+                <w:noProof/>
+                <w:sz w:val="24"/>
+                <w:szCs w:val="24"/>
+                <w:lang w:eastAsia="en-IN"/>
+              </w:rPr>
+              <w:tab/>
+            </w:r>
+            <w:r>
+              <w:rPr>
+                <w:rStyle w:val="Hyperlink"/>
+                <w:noProof/>
+              </w:rPr>
+              <w:t>What is Twelve-Factor App?</w:t>
+            </w:r>
+            <w:r>
+              <w:rPr>
+                <w:noProof/>
+                <w:webHidden/>
+              </w:rPr>
+              <w:tab/>
+            </w:r>
+            <w:r>
+              <w:rPr>
+                <w:noProof/>
+                <w:webHidden/>
+              </w:rPr>
+              <w:fldChar w:fldCharType="begin"/>
+            </w:r>
+            <w:r>
+              <w:rPr>
+                <w:noProof/>
+                <w:webHidden/>
+              </w:rPr>
+              <w:instrText xml:space="preserve"> PAGEREF _Toc209962421 \h </w:instrText>
+            </w:r>
+            <w:r>
+              <w:rPr>
+                <w:noProof/>
+                <w:webHidden/>
+              </w:rPr>
+            </w:r>
+            <w:r>
+              <w:rPr>
+                <w:noProof/>
+                <w:webHidden/>
+              </w:rPr>
+              <w:fldChar w:fldCharType="separate"/>
+            </w:r>
+            <w:r>
+              <w:rPr>
+                <w:noProof/>
+                <w:webHidden/>
+              </w:rPr>
+              <w:t>15</w:t>
             </w:r>
             <w:r>
               <w:rPr>
@@ -1967,9 +2237,8 @@
           <w:numId w:val="1"/>
         </w:numPr>
       </w:pPr>
-      <w:bookmarkStart w:id="0" w:name="_Toc207569865"/>
-      <w:r>
-        <w:lastRenderedPageBreak/>
+      <w:bookmarkStart w:id="0" w:name="_Toc209962398"/>
+      <w:r>
         <w:t>What do we require microservice and features of it?</w:t>
       </w:r>
       <w:bookmarkEnd w:id="0"/>
@@ -2230,7 +2499,7 @@
         </w:numPr>
       </w:pPr>
       <w:bookmarkStart w:id="1" w:name="_Toc187395991"/>
-      <w:bookmarkStart w:id="2" w:name="_Toc207569866"/>
+      <w:bookmarkStart w:id="2" w:name="_Toc209962399"/>
       <w:r>
         <w:t xml:space="preserve">Diff between the </w:t>
       </w:r>
@@ -2585,7 +2854,7 @@
         </w:numPr>
       </w:pPr>
       <w:bookmarkStart w:id="3" w:name="_Toc187395994"/>
-      <w:bookmarkStart w:id="4" w:name="_Toc207569867"/>
+      <w:bookmarkStart w:id="4" w:name="_Toc209962400"/>
       <w:r>
         <w:t>What is blue green deployment?</w:t>
       </w:r>
@@ -2637,7 +2906,7 @@
         </w:numPr>
       </w:pPr>
       <w:bookmarkStart w:id="6" w:name="_Toc187395997"/>
-      <w:bookmarkStart w:id="7" w:name="_Toc207569868"/>
+      <w:bookmarkStart w:id="7" w:name="_Toc209962401"/>
       <w:r>
         <w:t>What is Saga pattern in microservices?</w:t>
       </w:r>
@@ -2690,7 +2959,7 @@
         </w:numPr>
       </w:pPr>
       <w:bookmarkStart w:id="9" w:name="_Toc187396003"/>
-      <w:bookmarkStart w:id="10" w:name="_Toc207569869"/>
+      <w:bookmarkStart w:id="10" w:name="_Toc209962402"/>
       <w:r>
         <w:lastRenderedPageBreak/>
         <w:t>What is Circuit Breaker in microservice?</w:t>
@@ -2890,7 +3159,7 @@
         </w:numPr>
       </w:pPr>
       <w:bookmarkStart w:id="12" w:name="_Toc187396006"/>
-      <w:bookmarkStart w:id="13" w:name="_Toc207569870"/>
+      <w:bookmarkStart w:id="13" w:name="_Toc209962403"/>
       <w:r>
         <w:t>How to microservices communicate with each other in spring boot?</w:t>
       </w:r>
@@ -3046,7 +3315,7 @@
         </w:numPr>
       </w:pPr>
       <w:bookmarkStart w:id="15" w:name="_Toc187396008"/>
-      <w:bookmarkStart w:id="16" w:name="_Toc207569871"/>
+      <w:bookmarkStart w:id="16" w:name="_Toc209962404"/>
       <w:r>
         <w:t>Diff between the synchronous and asynchronous</w:t>
       </w:r>
@@ -3670,7 +3939,7 @@
         </w:numPr>
       </w:pPr>
       <w:bookmarkStart w:id="17" w:name="_Toc187396012"/>
-      <w:bookmarkStart w:id="18" w:name="_Toc207569872"/>
+      <w:bookmarkStart w:id="18" w:name="_Toc209962405"/>
       <w:r>
         <w:lastRenderedPageBreak/>
         <w:t xml:space="preserve">Why spring deprecated the rest template? or it’s </w:t>
@@ -3795,7 +4064,7 @@
           <w:numId w:val="1"/>
         </w:numPr>
       </w:pPr>
-      <w:bookmarkStart w:id="19" w:name="_Toc207569873"/>
+      <w:bookmarkStart w:id="19" w:name="_Toc209962406"/>
       <w:r>
         <w:t>What is API gateway</w:t>
       </w:r>
@@ -3831,7 +4100,7 @@
           <w:numId w:val="1"/>
         </w:numPr>
       </w:pPr>
-      <w:bookmarkStart w:id="20" w:name="_Toc207569874"/>
+      <w:bookmarkStart w:id="20" w:name="_Toc209962407"/>
       <w:r>
         <w:t>What is Spring Cloud</w:t>
       </w:r>
@@ -4184,7 +4453,7 @@
         </w:numPr>
       </w:pPr>
       <w:bookmarkStart w:id="21" w:name="_Toc187396005"/>
-      <w:bookmarkStart w:id="22" w:name="_Toc207569875"/>
+      <w:bookmarkStart w:id="22" w:name="_Toc209962408"/>
       <w:r>
         <w:t>Tell me about some design pattern in microservice?</w:t>
       </w:r>
@@ -4390,7 +4659,7 @@
           <w:numId w:val="1"/>
         </w:numPr>
       </w:pPr>
-      <w:bookmarkStart w:id="23" w:name="_Toc207569876"/>
+      <w:bookmarkStart w:id="23" w:name="_Toc209962409"/>
       <w:r>
         <w:t xml:space="preserve">What is Hystrix </w:t>
       </w:r>
@@ -4550,7 +4819,7 @@
           <w:numId w:val="1"/>
         </w:numPr>
       </w:pPr>
-      <w:bookmarkStart w:id="24" w:name="_Toc207569877"/>
+      <w:bookmarkStart w:id="24" w:name="_Toc209962410"/>
       <w:r>
         <w:t>What is Discovery Service in microservice?</w:t>
       </w:r>
@@ -4581,7 +4850,7 @@
           <w:numId w:val="1"/>
         </w:numPr>
       </w:pPr>
-      <w:bookmarkStart w:id="25" w:name="_Toc207569878"/>
+      <w:bookmarkStart w:id="25" w:name="_Toc209962411"/>
       <w:r>
         <w:t>What is resilience in microservices?</w:t>
       </w:r>
@@ -4921,7 +5190,7 @@
           <w:numId w:val="1"/>
         </w:numPr>
       </w:pPr>
-      <w:bookmarkStart w:id="26" w:name="_Toc207569879"/>
+      <w:bookmarkStart w:id="26" w:name="_Toc209962412"/>
       <w:r>
         <w:t>Domain-Oriented Microservice Architecture</w:t>
       </w:r>
@@ -4951,7 +5220,7 @@
           <w:numId w:val="1"/>
         </w:numPr>
       </w:pPr>
-      <w:bookmarkStart w:id="27" w:name="_Toc207569880"/>
+      <w:bookmarkStart w:id="27" w:name="_Toc209962413"/>
       <w:r>
         <w:t xml:space="preserve">What is the </w:t>
       </w:r>
@@ -5335,16 +5604,13 @@
           <w:numId w:val="1"/>
         </w:numPr>
       </w:pPr>
-      <w:bookmarkStart w:id="28" w:name="_Toc207569881"/>
+      <w:bookmarkStart w:id="28" w:name="_Toc209962414"/>
       <w:r>
         <w:t xml:space="preserve">What is the </w:t>
       </w:r>
       <w:proofErr w:type="spellStart"/>
       <w:r>
-        <w:t>Rest</w:t>
-      </w:r>
-      <w:r>
-        <w:t>Client</w:t>
+        <w:t>RestClient</w:t>
       </w:r>
       <w:proofErr w:type="spellEnd"/>
       <w:r>
@@ -5669,17 +5935,14 @@
           <w:numId w:val="1"/>
         </w:numPr>
       </w:pPr>
-      <w:bookmarkStart w:id="29" w:name="_Toc207569882"/>
+      <w:bookmarkStart w:id="29" w:name="_Toc209962415"/>
       <w:r>
         <w:lastRenderedPageBreak/>
         <w:t xml:space="preserve">What is the </w:t>
       </w:r>
       <w:proofErr w:type="spellStart"/>
       <w:r>
-        <w:t>Feign</w:t>
-      </w:r>
-      <w:r>
-        <w:t>Client</w:t>
+        <w:t>FeignClient</w:t>
       </w:r>
       <w:proofErr w:type="spellEnd"/>
       <w:r>
@@ -6247,16 +6510,13 @@
           <w:numId w:val="1"/>
         </w:numPr>
       </w:pPr>
-      <w:bookmarkStart w:id="30" w:name="_Toc207569883"/>
+      <w:bookmarkStart w:id="30" w:name="_Toc209962416"/>
       <w:r>
         <w:t xml:space="preserve">What is the </w:t>
       </w:r>
       <w:proofErr w:type="spellStart"/>
       <w:r>
-        <w:t>Web</w:t>
-      </w:r>
-      <w:r>
-        <w:t>Client</w:t>
+        <w:t>WebClient</w:t>
       </w:r>
       <w:proofErr w:type="spellEnd"/>
       <w:r>
@@ -6673,7 +6933,7 @@
           <w:numId w:val="1"/>
         </w:numPr>
       </w:pPr>
-      <w:bookmarkStart w:id="31" w:name="_Toc207569884"/>
+      <w:bookmarkStart w:id="31" w:name="_Toc209962417"/>
       <w:r>
         <w:t xml:space="preserve">What is the </w:t>
       </w:r>
@@ -7107,7 +7367,7 @@
           <w:numId w:val="1"/>
         </w:numPr>
       </w:pPr>
-      <w:bookmarkStart w:id="32" w:name="_Toc207569885"/>
+      <w:bookmarkStart w:id="32" w:name="_Toc209962418"/>
       <w:r>
         <w:t xml:space="preserve">What is the </w:t>
       </w:r>
@@ -7350,11 +7610,1129 @@
         <w:t xml:space="preserve"> – Works well in microservices with heavy inter-service communication.</w:t>
       </w:r>
     </w:p>
+    <w:p/>
+    <w:p>
+      <w:pPr>
+        <w:pStyle w:val="Heading2"/>
+        <w:numPr>
+          <w:ilvl w:val="0"/>
+          <w:numId w:val="1"/>
+        </w:numPr>
+      </w:pPr>
+      <w:bookmarkStart w:id="33" w:name="_Toc209962419"/>
+      <w:r>
+        <w:t xml:space="preserve">What is the </w:t>
+      </w:r>
+      <w:r>
+        <w:t>serverless architecture</w:t>
+      </w:r>
+      <w:r>
+        <w:t>?</w:t>
+      </w:r>
+      <w:bookmarkEnd w:id="33"/>
+    </w:p>
     <w:p>
       <w:pPr>
         <w:ind w:left="360" w:firstLine="360"/>
       </w:pPr>
-    </w:p>
+      <w:r>
+        <w:t>Serverless computing (or serverless architecture) is a cloud execution model in which the cloud provider automatically manages the provisioning, scaling, and maintenance of servers. Developers only need to write and deploy their application code in the form of small functions that run in stateless environments. These functions are typically triggered by events such as HTTP requests, database changes, or file uploads. Since the infrastructure is fully handled by the provider, developers can focus on business logic without worrying about server management, capacity planning, or scaling.</w:t>
+      </w:r>
+    </w:p>
+    <w:p>
+      <w:pPr>
+        <w:ind w:firstLine="360"/>
+        <w:rPr>
+          <w:b/>
+          <w:bCs/>
+        </w:rPr>
+      </w:pPr>
+      <w:r>
+        <w:rPr>
+          <w:b/>
+          <w:bCs/>
+        </w:rPr>
+        <w:t>Advantages of Serverless</w:t>
+      </w:r>
+    </w:p>
+    <w:p>
+      <w:pPr>
+        <w:numPr>
+          <w:ilvl w:val="0"/>
+          <w:numId w:val="28"/>
+        </w:numPr>
+        <w:tabs>
+          <w:tab w:val="num" w:pos="720"/>
+        </w:tabs>
+      </w:pPr>
+      <w:r>
+        <w:t>No need to manage or maintain servers — the provider handles provisioning, patching, and uptime.</w:t>
+      </w:r>
+    </w:p>
+    <w:p>
+      <w:pPr>
+        <w:numPr>
+          <w:ilvl w:val="0"/>
+          <w:numId w:val="28"/>
+        </w:numPr>
+        <w:tabs>
+          <w:tab w:val="num" w:pos="720"/>
+        </w:tabs>
+      </w:pPr>
+      <w:r>
+        <w:t>Automatic scaling based on demand — functions scale up or down seamlessly with workload.</w:t>
+      </w:r>
+    </w:p>
+    <w:p>
+      <w:pPr>
+        <w:numPr>
+          <w:ilvl w:val="0"/>
+          <w:numId w:val="28"/>
+        </w:numPr>
+        <w:tabs>
+          <w:tab w:val="num" w:pos="720"/>
+        </w:tabs>
+      </w:pPr>
+      <w:r>
+        <w:t>Cost efficiency — pay only for the actual compute time and resources consumed, not for idle servers.</w:t>
+      </w:r>
+    </w:p>
+    <w:p>
+      <w:pPr>
+        <w:numPr>
+          <w:ilvl w:val="0"/>
+          <w:numId w:val="28"/>
+        </w:numPr>
+        <w:tabs>
+          <w:tab w:val="num" w:pos="720"/>
+        </w:tabs>
+      </w:pPr>
+      <w:r>
+        <w:t>Event-driven execution model makes systems more modular and reactive.</w:t>
+      </w:r>
+    </w:p>
+    <w:p>
+      <w:pPr>
+        <w:numPr>
+          <w:ilvl w:val="0"/>
+          <w:numId w:val="28"/>
+        </w:numPr>
+        <w:tabs>
+          <w:tab w:val="num" w:pos="720"/>
+        </w:tabs>
+      </w:pPr>
+      <w:r>
+        <w:t>Faster time to market — developers focus on writing code rather than infrastructure setup.</w:t>
+      </w:r>
+    </w:p>
+    <w:p>
+      <w:pPr>
+        <w:numPr>
+          <w:ilvl w:val="0"/>
+          <w:numId w:val="28"/>
+        </w:numPr>
+        <w:tabs>
+          <w:tab w:val="num" w:pos="720"/>
+        </w:tabs>
+      </w:pPr>
+      <w:r>
+        <w:t>Better resource utilization — compute resources are allocated only when needed, avoiding waste.</w:t>
+      </w:r>
+    </w:p>
+    <w:p>
+      <w:pPr>
+        <w:ind w:left="360" w:firstLine="360"/>
+      </w:pPr>
+    </w:p>
+    <w:p>
+      <w:pPr>
+        <w:pStyle w:val="Heading2"/>
+        <w:numPr>
+          <w:ilvl w:val="0"/>
+          <w:numId w:val="1"/>
+        </w:numPr>
+      </w:pPr>
+      <w:bookmarkStart w:id="34" w:name="_Toc209962420"/>
+      <w:r>
+        <w:t>Difference between the monolithic, microservice and serverless architecture</w:t>
+      </w:r>
+      <w:bookmarkEnd w:id="34"/>
+    </w:p>
+    <w:tbl>
+      <w:tblPr>
+        <w:tblStyle w:val="PlainTable1"/>
+        <w:tblW w:w="0" w:type="auto"/>
+        <w:tblLook w:val="04A0" w:firstRow="1" w:lastRow="0" w:firstColumn="1" w:lastColumn="0" w:noHBand="0" w:noVBand="1"/>
+      </w:tblPr>
+      <w:tblGrid>
+        <w:gridCol w:w="2136"/>
+        <w:gridCol w:w="2819"/>
+        <w:gridCol w:w="2760"/>
+        <w:gridCol w:w="2741"/>
+      </w:tblGrid>
+      <w:tr>
+        <w:trPr>
+          <w:cnfStyle w:val="100000000000" w:firstRow="1" w:lastRow="0" w:firstColumn="0" w:lastColumn="0" w:oddVBand="0" w:evenVBand="0" w:oddHBand="0" w:evenHBand="0" w:firstRowFirstColumn="0" w:firstRowLastColumn="0" w:lastRowFirstColumn="0" w:lastRowLastColumn="0"/>
+        </w:trPr>
+        <w:tc>
+          <w:tcPr>
+            <w:cnfStyle w:val="001000000000" w:firstRow="0" w:lastRow="0" w:firstColumn="1" w:lastColumn="0" w:oddVBand="0" w:evenVBand="0" w:oddHBand="0" w:evenHBand="0" w:firstRowFirstColumn="0" w:firstRowLastColumn="0" w:lastRowFirstColumn="0" w:lastRowLastColumn="0"/>
+            <w:tcW w:w="0" w:type="auto"/>
+            <w:hideMark/>
+          </w:tcPr>
+          <w:p>
+            <w:pPr>
+              <w:spacing w:after="160" w:line="259" w:lineRule="auto"/>
+            </w:pPr>
+            <w:r>
+              <w:t>Feature</w:t>
+            </w:r>
+          </w:p>
+        </w:tc>
+        <w:tc>
+          <w:tcPr>
+            <w:tcW w:w="0" w:type="auto"/>
+            <w:hideMark/>
+          </w:tcPr>
+          <w:p>
+            <w:pPr>
+              <w:spacing w:after="160" w:line="259" w:lineRule="auto"/>
+              <w:cnfStyle w:val="100000000000" w:firstRow="1" w:lastRow="0" w:firstColumn="0" w:lastColumn="0" w:oddVBand="0" w:evenVBand="0" w:oddHBand="0" w:evenHBand="0" w:firstRowFirstColumn="0" w:firstRowLastColumn="0" w:lastRowFirstColumn="0" w:lastRowLastColumn="0"/>
+            </w:pPr>
+            <w:r>
+              <w:t>Monolithic Architecture</w:t>
+            </w:r>
+          </w:p>
+        </w:tc>
+        <w:tc>
+          <w:tcPr>
+            <w:tcW w:w="0" w:type="auto"/>
+            <w:hideMark/>
+          </w:tcPr>
+          <w:p>
+            <w:pPr>
+              <w:spacing w:after="160" w:line="259" w:lineRule="auto"/>
+              <w:cnfStyle w:val="100000000000" w:firstRow="1" w:lastRow="0" w:firstColumn="0" w:lastColumn="0" w:oddVBand="0" w:evenVBand="0" w:oddHBand="0" w:evenHBand="0" w:firstRowFirstColumn="0" w:firstRowLastColumn="0" w:lastRowFirstColumn="0" w:lastRowLastColumn="0"/>
+            </w:pPr>
+            <w:r>
+              <w:t>Microservices Architecture</w:t>
+            </w:r>
+          </w:p>
+        </w:tc>
+        <w:tc>
+          <w:tcPr>
+            <w:tcW w:w="0" w:type="auto"/>
+            <w:hideMark/>
+          </w:tcPr>
+          <w:p>
+            <w:pPr>
+              <w:spacing w:after="160" w:line="259" w:lineRule="auto"/>
+              <w:cnfStyle w:val="100000000000" w:firstRow="1" w:lastRow="0" w:firstColumn="0" w:lastColumn="0" w:oddVBand="0" w:evenVBand="0" w:oddHBand="0" w:evenHBand="0" w:firstRowFirstColumn="0" w:firstRowLastColumn="0" w:lastRowFirstColumn="0" w:lastRowLastColumn="0"/>
+            </w:pPr>
+            <w:r>
+              <w:t>Serverless Architecture</w:t>
+            </w:r>
+          </w:p>
+        </w:tc>
+      </w:tr>
+      <w:tr>
+        <w:trPr>
+          <w:cnfStyle w:val="000000100000" w:firstRow="0" w:lastRow="0" w:firstColumn="0" w:lastColumn="0" w:oddVBand="0" w:evenVBand="0" w:oddHBand="1" w:evenHBand="0" w:firstRowFirstColumn="0" w:firstRowLastColumn="0" w:lastRowFirstColumn="0" w:lastRowLastColumn="0"/>
+        </w:trPr>
+        <w:tc>
+          <w:tcPr>
+            <w:cnfStyle w:val="001000000000" w:firstRow="0" w:lastRow="0" w:firstColumn="1" w:lastColumn="0" w:oddVBand="0" w:evenVBand="0" w:oddHBand="0" w:evenHBand="0" w:firstRowFirstColumn="0" w:firstRowLastColumn="0" w:lastRowFirstColumn="0" w:lastRowLastColumn="0"/>
+            <w:tcW w:w="0" w:type="auto"/>
+            <w:hideMark/>
+          </w:tcPr>
+          <w:p>
+            <w:pPr>
+              <w:spacing w:after="160" w:line="259" w:lineRule="auto"/>
+            </w:pPr>
+            <w:r>
+              <w:t>Deployment</w:t>
+            </w:r>
+          </w:p>
+        </w:tc>
+        <w:tc>
+          <w:tcPr>
+            <w:tcW w:w="0" w:type="auto"/>
+            <w:hideMark/>
+          </w:tcPr>
+          <w:p>
+            <w:pPr>
+              <w:spacing w:after="160" w:line="259" w:lineRule="auto"/>
+              <w:cnfStyle w:val="000000100000" w:firstRow="0" w:lastRow="0" w:firstColumn="0" w:lastColumn="0" w:oddVBand="0" w:evenVBand="0" w:oddHBand="1" w:evenHBand="0" w:firstRowFirstColumn="0" w:firstRowLastColumn="0" w:lastRowFirstColumn="0" w:lastRowLastColumn="0"/>
+            </w:pPr>
+            <w:r>
+              <w:t>Entire application deployed as a single unit</w:t>
+            </w:r>
+          </w:p>
+        </w:tc>
+        <w:tc>
+          <w:tcPr>
+            <w:tcW w:w="0" w:type="auto"/>
+            <w:hideMark/>
+          </w:tcPr>
+          <w:p>
+            <w:pPr>
+              <w:spacing w:after="160" w:line="259" w:lineRule="auto"/>
+              <w:cnfStyle w:val="000000100000" w:firstRow="0" w:lastRow="0" w:firstColumn="0" w:lastColumn="0" w:oddVBand="0" w:evenVBand="0" w:oddHBand="1" w:evenHBand="0" w:firstRowFirstColumn="0" w:firstRowLastColumn="0" w:lastRowFirstColumn="0" w:lastRowLastColumn="0"/>
+            </w:pPr>
+            <w:r>
+              <w:t>Independent deployment of individual services</w:t>
+            </w:r>
+          </w:p>
+        </w:tc>
+        <w:tc>
+          <w:tcPr>
+            <w:tcW w:w="0" w:type="auto"/>
+            <w:hideMark/>
+          </w:tcPr>
+          <w:p>
+            <w:pPr>
+              <w:spacing w:after="160" w:line="259" w:lineRule="auto"/>
+              <w:cnfStyle w:val="000000100000" w:firstRow="0" w:lastRow="0" w:firstColumn="0" w:lastColumn="0" w:oddVBand="0" w:evenVBand="0" w:oddHBand="1" w:evenHBand="0" w:firstRowFirstColumn="0" w:firstRowLastColumn="0" w:lastRowFirstColumn="0" w:lastRowLastColumn="0"/>
+            </w:pPr>
+            <w:r>
+              <w:t>Functions deployed in response to events/triggers</w:t>
+            </w:r>
+          </w:p>
+        </w:tc>
+      </w:tr>
+      <w:tr>
+        <w:tc>
+          <w:tcPr>
+            <w:cnfStyle w:val="001000000000" w:firstRow="0" w:lastRow="0" w:firstColumn="1" w:lastColumn="0" w:oddVBand="0" w:evenVBand="0" w:oddHBand="0" w:evenHBand="0" w:firstRowFirstColumn="0" w:firstRowLastColumn="0" w:lastRowFirstColumn="0" w:lastRowLastColumn="0"/>
+            <w:tcW w:w="0" w:type="auto"/>
+            <w:hideMark/>
+          </w:tcPr>
+          <w:p>
+            <w:pPr>
+              <w:spacing w:after="160" w:line="259" w:lineRule="auto"/>
+            </w:pPr>
+            <w:r>
+              <w:t>Scalability</w:t>
+            </w:r>
+          </w:p>
+        </w:tc>
+        <w:tc>
+          <w:tcPr>
+            <w:tcW w:w="0" w:type="auto"/>
+            <w:hideMark/>
+          </w:tcPr>
+          <w:p>
+            <w:pPr>
+              <w:spacing w:after="160" w:line="259" w:lineRule="auto"/>
+              <w:cnfStyle w:val="000000000000" w:firstRow="0" w:lastRow="0" w:firstColumn="0" w:lastColumn="0" w:oddVBand="0" w:evenVBand="0" w:oddHBand="0" w:evenHBand="0" w:firstRowFirstColumn="0" w:firstRowLastColumn="0" w:lastRowFirstColumn="0" w:lastRowLastColumn="0"/>
+            </w:pPr>
+            <w:r>
+              <w:t>Scales entire application together, lacks granular scalability</w:t>
+            </w:r>
+          </w:p>
+        </w:tc>
+        <w:tc>
+          <w:tcPr>
+            <w:tcW w:w="0" w:type="auto"/>
+            <w:hideMark/>
+          </w:tcPr>
+          <w:p>
+            <w:pPr>
+              <w:spacing w:after="160" w:line="259" w:lineRule="auto"/>
+              <w:cnfStyle w:val="000000000000" w:firstRow="0" w:lastRow="0" w:firstColumn="0" w:lastColumn="0" w:oddVBand="0" w:evenVBand="0" w:oddHBand="0" w:evenHBand="0" w:firstRowFirstColumn="0" w:firstRowLastColumn="0" w:lastRowFirstColumn="0" w:lastRowLastColumn="0"/>
+            </w:pPr>
+            <w:r>
+              <w:t>Allows independent scaling of services</w:t>
+            </w:r>
+          </w:p>
+        </w:tc>
+        <w:tc>
+          <w:tcPr>
+            <w:tcW w:w="0" w:type="auto"/>
+            <w:hideMark/>
+          </w:tcPr>
+          <w:p>
+            <w:pPr>
+              <w:spacing w:after="160" w:line="259" w:lineRule="auto"/>
+              <w:cnfStyle w:val="000000000000" w:firstRow="0" w:lastRow="0" w:firstColumn="0" w:lastColumn="0" w:oddVBand="0" w:evenVBand="0" w:oddHBand="0" w:evenHBand="0" w:firstRowFirstColumn="0" w:firstRowLastColumn="0" w:lastRowFirstColumn="0" w:lastRowLastColumn="0"/>
+            </w:pPr>
+            <w:r>
+              <w:t>Auto-scales based on demand, operates on a pay-per-use model</w:t>
+            </w:r>
+          </w:p>
+        </w:tc>
+      </w:tr>
+      <w:tr>
+        <w:trPr>
+          <w:cnfStyle w:val="000000100000" w:firstRow="0" w:lastRow="0" w:firstColumn="0" w:lastColumn="0" w:oddVBand="0" w:evenVBand="0" w:oddHBand="1" w:evenHBand="0" w:firstRowFirstColumn="0" w:firstRowLastColumn="0" w:lastRowFirstColumn="0" w:lastRowLastColumn="0"/>
+        </w:trPr>
+        <w:tc>
+          <w:tcPr>
+            <w:cnfStyle w:val="001000000000" w:firstRow="0" w:lastRow="0" w:firstColumn="1" w:lastColumn="0" w:oddVBand="0" w:evenVBand="0" w:oddHBand="0" w:evenHBand="0" w:firstRowFirstColumn="0" w:firstRowLastColumn="0" w:lastRowFirstColumn="0" w:lastRowLastColumn="0"/>
+            <w:tcW w:w="0" w:type="auto"/>
+            <w:hideMark/>
+          </w:tcPr>
+          <w:p>
+            <w:pPr>
+              <w:spacing w:after="160" w:line="259" w:lineRule="auto"/>
+            </w:pPr>
+            <w:r>
+              <w:t>Inter-service Communication</w:t>
+            </w:r>
+          </w:p>
+        </w:tc>
+        <w:tc>
+          <w:tcPr>
+            <w:tcW w:w="0" w:type="auto"/>
+            <w:hideMark/>
+          </w:tcPr>
+          <w:p>
+            <w:pPr>
+              <w:spacing w:after="160" w:line="259" w:lineRule="auto"/>
+              <w:cnfStyle w:val="000000100000" w:firstRow="0" w:lastRow="0" w:firstColumn="0" w:lastColumn="0" w:oddVBand="0" w:evenVBand="0" w:oddHBand="1" w:evenHBand="0" w:firstRowFirstColumn="0" w:firstRowLastColumn="0" w:lastRowFirstColumn="0" w:lastRowLastColumn="0"/>
+            </w:pPr>
+            <w:r>
+              <w:t>Tightly coupled components, direct method/function calls</w:t>
+            </w:r>
+          </w:p>
+        </w:tc>
+        <w:tc>
+          <w:tcPr>
+            <w:tcW w:w="0" w:type="auto"/>
+            <w:hideMark/>
+          </w:tcPr>
+          <w:p>
+            <w:pPr>
+              <w:spacing w:after="160" w:line="259" w:lineRule="auto"/>
+              <w:cnfStyle w:val="000000100000" w:firstRow="0" w:lastRow="0" w:firstColumn="0" w:lastColumn="0" w:oddVBand="0" w:evenVBand="0" w:oddHBand="1" w:evenHBand="0" w:firstRowFirstColumn="0" w:firstRowLastColumn="0" w:lastRowFirstColumn="0" w:lastRowLastColumn="0"/>
+            </w:pPr>
+            <w:r>
+              <w:t>Uses lightweight protocols like HTTP, message queues</w:t>
+            </w:r>
+          </w:p>
+        </w:tc>
+        <w:tc>
+          <w:tcPr>
+            <w:tcW w:w="0" w:type="auto"/>
+            <w:hideMark/>
+          </w:tcPr>
+          <w:p>
+            <w:pPr>
+              <w:spacing w:after="160" w:line="259" w:lineRule="auto"/>
+              <w:cnfStyle w:val="000000100000" w:firstRow="0" w:lastRow="0" w:firstColumn="0" w:lastColumn="0" w:oddVBand="0" w:evenVBand="0" w:oddHBand="1" w:evenHBand="0" w:firstRowFirstColumn="0" w:firstRowLastColumn="0" w:lastRowFirstColumn="0" w:lastRowLastColumn="0"/>
+            </w:pPr>
+            <w:r>
+              <w:t>Event-driven, functions triggered by specific events</w:t>
+            </w:r>
+          </w:p>
+        </w:tc>
+      </w:tr>
+      <w:tr>
+        <w:tc>
+          <w:tcPr>
+            <w:cnfStyle w:val="001000000000" w:firstRow="0" w:lastRow="0" w:firstColumn="1" w:lastColumn="0" w:oddVBand="0" w:evenVBand="0" w:oddHBand="0" w:evenHBand="0" w:firstRowFirstColumn="0" w:firstRowLastColumn="0" w:lastRowFirstColumn="0" w:lastRowLastColumn="0"/>
+            <w:tcW w:w="0" w:type="auto"/>
+            <w:hideMark/>
+          </w:tcPr>
+          <w:p>
+            <w:pPr>
+              <w:spacing w:after="160" w:line="259" w:lineRule="auto"/>
+            </w:pPr>
+            <w:r>
+              <w:t>Development &amp; Maintenance</w:t>
+            </w:r>
+          </w:p>
+        </w:tc>
+        <w:tc>
+          <w:tcPr>
+            <w:tcW w:w="0" w:type="auto"/>
+            <w:hideMark/>
+          </w:tcPr>
+          <w:p>
+            <w:pPr>
+              <w:spacing w:after="160" w:line="259" w:lineRule="auto"/>
+              <w:cnfStyle w:val="000000000000" w:firstRow="0" w:lastRow="0" w:firstColumn="0" w:lastColumn="0" w:oddVBand="0" w:evenVBand="0" w:oddHBand="0" w:evenHBand="0" w:firstRowFirstColumn="0" w:firstRowLastColumn="0" w:lastRowFirstColumn="0" w:lastRowLastColumn="0"/>
+            </w:pPr>
+            <w:r>
+              <w:t>Unified codebase, complex updates and maintenance</w:t>
+            </w:r>
+          </w:p>
+        </w:tc>
+        <w:tc>
+          <w:tcPr>
+            <w:tcW w:w="0" w:type="auto"/>
+            <w:hideMark/>
+          </w:tcPr>
+          <w:p>
+            <w:pPr>
+              <w:spacing w:after="160" w:line="259" w:lineRule="auto"/>
+              <w:cnfStyle w:val="000000000000" w:firstRow="0" w:lastRow="0" w:firstColumn="0" w:lastColumn="0" w:oddVBand="0" w:evenVBand="0" w:oddHBand="0" w:evenHBand="0" w:firstRowFirstColumn="0" w:firstRowLastColumn="0" w:lastRowFirstColumn="0" w:lastRowLastColumn="0"/>
+            </w:pPr>
+            <w:r>
+              <w:t>Easier to develop, update, and maintain independent services</w:t>
+            </w:r>
+          </w:p>
+        </w:tc>
+        <w:tc>
+          <w:tcPr>
+            <w:tcW w:w="0" w:type="auto"/>
+            <w:hideMark/>
+          </w:tcPr>
+          <w:p>
+            <w:pPr>
+              <w:spacing w:after="160" w:line="259" w:lineRule="auto"/>
+              <w:cnfStyle w:val="000000000000" w:firstRow="0" w:lastRow="0" w:firstColumn="0" w:lastColumn="0" w:oddVBand="0" w:evenVBand="0" w:oddHBand="0" w:evenHBand="0" w:firstRowFirstColumn="0" w:firstRowLastColumn="0" w:lastRowFirstColumn="0" w:lastRowLastColumn="0"/>
+            </w:pPr>
+            <w:r>
+              <w:t>Focused on writing and deploying functions, reduced maintenance</w:t>
+            </w:r>
+          </w:p>
+        </w:tc>
+      </w:tr>
+      <w:tr>
+        <w:trPr>
+          <w:cnfStyle w:val="000000100000" w:firstRow="0" w:lastRow="0" w:firstColumn="0" w:lastColumn="0" w:oddVBand="0" w:evenVBand="0" w:oddHBand="1" w:evenHBand="0" w:firstRowFirstColumn="0" w:firstRowLastColumn="0" w:lastRowFirstColumn="0" w:lastRowLastColumn="0"/>
+        </w:trPr>
+        <w:tc>
+          <w:tcPr>
+            <w:cnfStyle w:val="001000000000" w:firstRow="0" w:lastRow="0" w:firstColumn="1" w:lastColumn="0" w:oddVBand="0" w:evenVBand="0" w:oddHBand="0" w:evenHBand="0" w:firstRowFirstColumn="0" w:firstRowLastColumn="0" w:lastRowFirstColumn="0" w:lastRowLastColumn="0"/>
+            <w:tcW w:w="0" w:type="auto"/>
+            <w:hideMark/>
+          </w:tcPr>
+          <w:p>
+            <w:pPr>
+              <w:spacing w:after="160" w:line="259" w:lineRule="auto"/>
+            </w:pPr>
+            <w:r>
+              <w:lastRenderedPageBreak/>
+              <w:t>Technology Diversity</w:t>
+            </w:r>
+          </w:p>
+        </w:tc>
+        <w:tc>
+          <w:tcPr>
+            <w:tcW w:w="0" w:type="auto"/>
+            <w:hideMark/>
+          </w:tcPr>
+          <w:p>
+            <w:pPr>
+              <w:spacing w:after="160" w:line="259" w:lineRule="auto"/>
+              <w:cnfStyle w:val="000000100000" w:firstRow="0" w:lastRow="0" w:firstColumn="0" w:lastColumn="0" w:oddVBand="0" w:evenVBand="0" w:oddHBand="1" w:evenHBand="0" w:firstRowFirstColumn="0" w:firstRowLastColumn="0" w:lastRowFirstColumn="0" w:lastRowLastColumn="0"/>
+            </w:pPr>
+            <w:r>
+              <w:t>Uniform technology stack throughout the application</w:t>
+            </w:r>
+          </w:p>
+        </w:tc>
+        <w:tc>
+          <w:tcPr>
+            <w:tcW w:w="0" w:type="auto"/>
+            <w:hideMark/>
+          </w:tcPr>
+          <w:p>
+            <w:pPr>
+              <w:spacing w:after="160" w:line="259" w:lineRule="auto"/>
+              <w:cnfStyle w:val="000000100000" w:firstRow="0" w:lastRow="0" w:firstColumn="0" w:lastColumn="0" w:oddVBand="0" w:evenVBand="0" w:oddHBand="1" w:evenHBand="0" w:firstRowFirstColumn="0" w:firstRowLastColumn="0" w:lastRowFirstColumn="0" w:lastRowLastColumn="0"/>
+            </w:pPr>
+            <w:r>
+              <w:t>Permits diverse technologies per service’s specific needs</w:t>
+            </w:r>
+          </w:p>
+        </w:tc>
+        <w:tc>
+          <w:tcPr>
+            <w:tcW w:w="0" w:type="auto"/>
+            <w:hideMark/>
+          </w:tcPr>
+          <w:p>
+            <w:pPr>
+              <w:spacing w:after="160" w:line="259" w:lineRule="auto"/>
+              <w:cnfStyle w:val="000000100000" w:firstRow="0" w:lastRow="0" w:firstColumn="0" w:lastColumn="0" w:oddVBand="0" w:evenVBand="0" w:oddHBand="1" w:evenHBand="0" w:firstRowFirstColumn="0" w:firstRowLastColumn="0" w:lastRowFirstColumn="0" w:lastRowLastColumn="0"/>
+            </w:pPr>
+            <w:r>
+              <w:t>Relies on cloud provider’s managed services, limits tech diversity</w:t>
+            </w:r>
+          </w:p>
+        </w:tc>
+      </w:tr>
+      <w:tr>
+        <w:tc>
+          <w:tcPr>
+            <w:cnfStyle w:val="001000000000" w:firstRow="0" w:lastRow="0" w:firstColumn="1" w:lastColumn="0" w:oddVBand="0" w:evenVBand="0" w:oddHBand="0" w:evenHBand="0" w:firstRowFirstColumn="0" w:firstRowLastColumn="0" w:lastRowFirstColumn="0" w:lastRowLastColumn="0"/>
+            <w:tcW w:w="0" w:type="auto"/>
+            <w:hideMark/>
+          </w:tcPr>
+          <w:p>
+            <w:pPr>
+              <w:spacing w:after="160" w:line="259" w:lineRule="auto"/>
+            </w:pPr>
+            <w:r>
+              <w:t>Resource Utilization</w:t>
+            </w:r>
+          </w:p>
+        </w:tc>
+        <w:tc>
+          <w:tcPr>
+            <w:tcW w:w="0" w:type="auto"/>
+            <w:hideMark/>
+          </w:tcPr>
+          <w:p>
+            <w:pPr>
+              <w:spacing w:after="160" w:line="259" w:lineRule="auto"/>
+              <w:cnfStyle w:val="000000000000" w:firstRow="0" w:lastRow="0" w:firstColumn="0" w:lastColumn="0" w:oddVBand="0" w:evenVBand="0" w:oddHBand="0" w:evenHBand="0" w:firstRowFirstColumn="0" w:firstRowLastColumn="0" w:lastRowFirstColumn="0" w:lastRowLastColumn="0"/>
+            </w:pPr>
+            <w:r>
+              <w:t>Resource sharing across functionalities, potential wastage</w:t>
+            </w:r>
+          </w:p>
+        </w:tc>
+        <w:tc>
+          <w:tcPr>
+            <w:tcW w:w="0" w:type="auto"/>
+            <w:hideMark/>
+          </w:tcPr>
+          <w:p>
+            <w:pPr>
+              <w:spacing w:after="160" w:line="259" w:lineRule="auto"/>
+              <w:cnfStyle w:val="000000000000" w:firstRow="0" w:lastRow="0" w:firstColumn="0" w:lastColumn="0" w:oddVBand="0" w:evenVBand="0" w:oddHBand="0" w:evenHBand="0" w:firstRowFirstColumn="0" w:firstRowLastColumn="0" w:lastRowFirstColumn="0" w:lastRowLastColumn="0"/>
+            </w:pPr>
+            <w:r>
+              <w:t>Optimal resource utilization, scalability focused</w:t>
+            </w:r>
+          </w:p>
+        </w:tc>
+        <w:tc>
+          <w:tcPr>
+            <w:tcW w:w="0" w:type="auto"/>
+            <w:hideMark/>
+          </w:tcPr>
+          <w:p>
+            <w:pPr>
+              <w:spacing w:after="160" w:line="259" w:lineRule="auto"/>
+              <w:cnfStyle w:val="000000000000" w:firstRow="0" w:lastRow="0" w:firstColumn="0" w:lastColumn="0" w:oddVBand="0" w:evenVBand="0" w:oddHBand="0" w:evenHBand="0" w:firstRowFirstColumn="0" w:firstRowLastColumn="0" w:lastRowFirstColumn="0" w:lastRowLastColumn="0"/>
+            </w:pPr>
+            <w:r>
+              <w:t>Optimized resource usage, cost-efficient due to pay-per-use</w:t>
+            </w:r>
+          </w:p>
+        </w:tc>
+      </w:tr>
+      <w:tr>
+        <w:trPr>
+          <w:cnfStyle w:val="000000100000" w:firstRow="0" w:lastRow="0" w:firstColumn="0" w:lastColumn="0" w:oddVBand="0" w:evenVBand="0" w:oddHBand="1" w:evenHBand="0" w:firstRowFirstColumn="0" w:firstRowLastColumn="0" w:lastRowFirstColumn="0" w:lastRowLastColumn="0"/>
+        </w:trPr>
+        <w:tc>
+          <w:tcPr>
+            <w:cnfStyle w:val="001000000000" w:firstRow="0" w:lastRow="0" w:firstColumn="1" w:lastColumn="0" w:oddVBand="0" w:evenVBand="0" w:oddHBand="0" w:evenHBand="0" w:firstRowFirstColumn="0" w:firstRowLastColumn="0" w:lastRowFirstColumn="0" w:lastRowLastColumn="0"/>
+            <w:tcW w:w="0" w:type="auto"/>
+            <w:hideMark/>
+          </w:tcPr>
+          <w:p>
+            <w:pPr>
+              <w:spacing w:after="160" w:line="259" w:lineRule="auto"/>
+            </w:pPr>
+            <w:r>
+              <w:t>Fault Tolerance</w:t>
+            </w:r>
+          </w:p>
+        </w:tc>
+        <w:tc>
+          <w:tcPr>
+            <w:tcW w:w="0" w:type="auto"/>
+            <w:hideMark/>
+          </w:tcPr>
+          <w:p>
+            <w:pPr>
+              <w:spacing w:after="160" w:line="259" w:lineRule="auto"/>
+              <w:cnfStyle w:val="000000100000" w:firstRow="0" w:lastRow="0" w:firstColumn="0" w:lastColumn="0" w:oddVBand="0" w:evenVBand="0" w:oddHBand="1" w:evenHBand="0" w:firstRowFirstColumn="0" w:firstRowLastColumn="0" w:lastRowFirstColumn="0" w:lastRowLastColumn="0"/>
+            </w:pPr>
+            <w:r>
+              <w:t>Failure in one module can impact the entire system</w:t>
+            </w:r>
+          </w:p>
+        </w:tc>
+        <w:tc>
+          <w:tcPr>
+            <w:tcW w:w="0" w:type="auto"/>
+            <w:hideMark/>
+          </w:tcPr>
+          <w:p>
+            <w:pPr>
+              <w:spacing w:after="160" w:line="259" w:lineRule="auto"/>
+              <w:cnfStyle w:val="000000100000" w:firstRow="0" w:lastRow="0" w:firstColumn="0" w:lastColumn="0" w:oddVBand="0" w:evenVBand="0" w:oddHBand="1" w:evenHBand="0" w:firstRowFirstColumn="0" w:firstRowLastColumn="0" w:lastRowFirstColumn="0" w:lastRowLastColumn="0"/>
+            </w:pPr>
+            <w:r>
+              <w:t>Fault isolation, localized failures do not affect the whole system</w:t>
+            </w:r>
+          </w:p>
+        </w:tc>
+        <w:tc>
+          <w:tcPr>
+            <w:tcW w:w="0" w:type="auto"/>
+            <w:hideMark/>
+          </w:tcPr>
+          <w:p>
+            <w:pPr>
+              <w:spacing w:after="160" w:line="259" w:lineRule="auto"/>
+              <w:cnfStyle w:val="000000100000" w:firstRow="0" w:lastRow="0" w:firstColumn="0" w:lastColumn="0" w:oddVBand="0" w:evenVBand="0" w:oddHBand="1" w:evenHBand="0" w:firstRowFirstColumn="0" w:firstRowLastColumn="0" w:lastRowFirstColumn="0" w:lastRowLastColumn="0"/>
+            </w:pPr>
+            <w:r>
+              <w:t>Functions designed to be stateless, minimal impact on failure</w:t>
+            </w:r>
+          </w:p>
+        </w:tc>
+      </w:tr>
+      <w:tr>
+        <w:tc>
+          <w:tcPr>
+            <w:cnfStyle w:val="001000000000" w:firstRow="0" w:lastRow="0" w:firstColumn="1" w:lastColumn="0" w:oddVBand="0" w:evenVBand="0" w:oddHBand="0" w:evenHBand="0" w:firstRowFirstColumn="0" w:firstRowLastColumn="0" w:lastRowFirstColumn="0" w:lastRowLastColumn="0"/>
+            <w:tcW w:w="0" w:type="auto"/>
+            <w:hideMark/>
+          </w:tcPr>
+          <w:p>
+            <w:pPr>
+              <w:spacing w:after="160" w:line="259" w:lineRule="auto"/>
+            </w:pPr>
+            <w:r>
+              <w:t>Cost Efficiency</w:t>
+            </w:r>
+          </w:p>
+        </w:tc>
+        <w:tc>
+          <w:tcPr>
+            <w:tcW w:w="0" w:type="auto"/>
+            <w:hideMark/>
+          </w:tcPr>
+          <w:p>
+            <w:pPr>
+              <w:spacing w:after="160" w:line="259" w:lineRule="auto"/>
+              <w:cnfStyle w:val="000000000000" w:firstRow="0" w:lastRow="0" w:firstColumn="0" w:lastColumn="0" w:oddVBand="0" w:evenVBand="0" w:oddHBand="0" w:evenHBand="0" w:firstRowFirstColumn="0" w:firstRowLastColumn="0" w:lastRowFirstColumn="0" w:lastRowLastColumn="0"/>
+            </w:pPr>
+            <w:r>
+              <w:t>Fixed infrastructure costs, regardless of usage patterns</w:t>
+            </w:r>
+          </w:p>
+        </w:tc>
+        <w:tc>
+          <w:tcPr>
+            <w:tcW w:w="0" w:type="auto"/>
+            <w:hideMark/>
+          </w:tcPr>
+          <w:p>
+            <w:pPr>
+              <w:spacing w:after="160" w:line="259" w:lineRule="auto"/>
+              <w:cnfStyle w:val="000000000000" w:firstRow="0" w:lastRow="0" w:firstColumn="0" w:lastColumn="0" w:oddVBand="0" w:evenVBand="0" w:oddHBand="0" w:evenHBand="0" w:firstRowFirstColumn="0" w:firstRowLastColumn="0" w:lastRowFirstColumn="0" w:lastRowLastColumn="0"/>
+            </w:pPr>
+            <w:r>
+              <w:t>Cost-effective scaling, pay only for resources consumed</w:t>
+            </w:r>
+          </w:p>
+        </w:tc>
+        <w:tc>
+          <w:tcPr>
+            <w:tcW w:w="0" w:type="auto"/>
+            <w:hideMark/>
+          </w:tcPr>
+          <w:p>
+            <w:pPr>
+              <w:spacing w:after="160" w:line="259" w:lineRule="auto"/>
+              <w:cnfStyle w:val="000000000000" w:firstRow="0" w:lastRow="0" w:firstColumn="0" w:lastColumn="0" w:oddVBand="0" w:evenVBand="0" w:oddHBand="0" w:evenHBand="0" w:firstRowFirstColumn="0" w:firstRowLastColumn="0" w:lastRowFirstColumn="0" w:lastRowLastColumn="0"/>
+            </w:pPr>
+            <w:r>
+              <w:t>Pay-per-use model, cost-effective for sporadic workloads</w:t>
+            </w:r>
+          </w:p>
+        </w:tc>
+      </w:tr>
+      <w:tr>
+        <w:trPr>
+          <w:cnfStyle w:val="000000100000" w:firstRow="0" w:lastRow="0" w:firstColumn="0" w:lastColumn="0" w:oddVBand="0" w:evenVBand="0" w:oddHBand="1" w:evenHBand="0" w:firstRowFirstColumn="0" w:firstRowLastColumn="0" w:lastRowFirstColumn="0" w:lastRowLastColumn="0"/>
+        </w:trPr>
+        <w:tc>
+          <w:tcPr>
+            <w:cnfStyle w:val="001000000000" w:firstRow="0" w:lastRow="0" w:firstColumn="1" w:lastColumn="0" w:oddVBand="0" w:evenVBand="0" w:oddHBand="0" w:evenHBand="0" w:firstRowFirstColumn="0" w:firstRowLastColumn="0" w:lastRowFirstColumn="0" w:lastRowLastColumn="0"/>
+            <w:tcW w:w="0" w:type="auto"/>
+            <w:hideMark/>
+          </w:tcPr>
+          <w:p>
+            <w:pPr>
+              <w:spacing w:after="160" w:line="259" w:lineRule="auto"/>
+            </w:pPr>
+            <w:r>
+              <w:t>Operational Overhead</w:t>
+            </w:r>
+          </w:p>
+        </w:tc>
+        <w:tc>
+          <w:tcPr>
+            <w:tcW w:w="0" w:type="auto"/>
+            <w:hideMark/>
+          </w:tcPr>
+          <w:p>
+            <w:pPr>
+              <w:spacing w:after="160" w:line="259" w:lineRule="auto"/>
+              <w:cnfStyle w:val="000000100000" w:firstRow="0" w:lastRow="0" w:firstColumn="0" w:lastColumn="0" w:oddVBand="0" w:evenVBand="0" w:oddHBand="1" w:evenHBand="0" w:firstRowFirstColumn="0" w:firstRowLastColumn="0" w:lastRowFirstColumn="0" w:lastRowLastColumn="0"/>
+            </w:pPr>
+            <w:r>
+              <w:t>Centralized management, simpler operations but less flexibility</w:t>
+            </w:r>
+          </w:p>
+        </w:tc>
+        <w:tc>
+          <w:tcPr>
+            <w:tcW w:w="0" w:type="auto"/>
+            <w:hideMark/>
+          </w:tcPr>
+          <w:p>
+            <w:pPr>
+              <w:spacing w:after="160" w:line="259" w:lineRule="auto"/>
+              <w:cnfStyle w:val="000000100000" w:firstRow="0" w:lastRow="0" w:firstColumn="0" w:lastColumn="0" w:oddVBand="0" w:evenVBand="0" w:oddHBand="1" w:evenHBand="0" w:firstRowFirstColumn="0" w:firstRowLastColumn="0" w:lastRowFirstColumn="0" w:lastRowLastColumn="0"/>
+            </w:pPr>
+            <w:r>
+              <w:t>More complex operations due to multiple services and components</w:t>
+            </w:r>
+          </w:p>
+        </w:tc>
+        <w:tc>
+          <w:tcPr>
+            <w:tcW w:w="0" w:type="auto"/>
+            <w:hideMark/>
+          </w:tcPr>
+          <w:p>
+            <w:pPr>
+              <w:spacing w:after="160" w:line="259" w:lineRule="auto"/>
+              <w:cnfStyle w:val="000000100000" w:firstRow="0" w:lastRow="0" w:firstColumn="0" w:lastColumn="0" w:oddVBand="0" w:evenVBand="0" w:oddHBand="1" w:evenHBand="0" w:firstRowFirstColumn="0" w:firstRowLastColumn="0" w:lastRowFirstColumn="0" w:lastRowLastColumn="0"/>
+            </w:pPr>
+            <w:r>
+              <w:t>Reduced operational overhead, managed by the cloud provider</w:t>
+            </w:r>
+          </w:p>
+        </w:tc>
+      </w:tr>
+    </w:tbl>
+    <w:p/>
+    <w:p>
+      <w:pPr>
+        <w:pStyle w:val="Heading2"/>
+        <w:numPr>
+          <w:ilvl w:val="0"/>
+          <w:numId w:val="1"/>
+        </w:numPr>
+      </w:pPr>
+      <w:bookmarkStart w:id="35" w:name="_Toc209962421"/>
+      <w:r>
+        <w:t>What is Twelve-Factor App</w:t>
+      </w:r>
+      <w:r>
+        <w:t>?</w:t>
+      </w:r>
+      <w:bookmarkEnd w:id="35"/>
+    </w:p>
+    <w:p>
+      <w:pPr>
+        <w:ind w:left="360" w:firstLine="360"/>
+        <w:jc w:val="both"/>
+      </w:pPr>
+      <w:r>
+        <w:t>A Twelve-Factor App is a set of best practices for building modern, cloud-native applications. It was introduced by the co-founders of Heroku to help developers create apps that are portable, scalable, and maintainable. The methodology encourages clear separation of concerns, stateless processes, externalized configurations, and easy deployment across environments like development, staging, and production.</w:t>
+      </w:r>
+    </w:p>
+    <w:p>
+      <w:pPr>
+        <w:ind w:left="360"/>
+        <w:rPr>
+          <w:b/>
+          <w:bCs/>
+        </w:rPr>
+      </w:pPr>
+      <w:r>
+        <w:rPr>
+          <w:b/>
+          <w:bCs/>
+        </w:rPr>
+        <w:t>The 12 Factors</w:t>
+      </w:r>
+    </w:p>
+    <w:p>
+      <w:pPr>
+        <w:numPr>
+          <w:ilvl w:val="0"/>
+          <w:numId w:val="31"/>
+        </w:numPr>
+        <w:tabs>
+          <w:tab w:val="num" w:pos="720"/>
+        </w:tabs>
+      </w:pPr>
+      <w:r>
+        <w:rPr>
+          <w:b/>
+          <w:bCs/>
+        </w:rPr>
+        <w:t>Codebase</w:t>
+      </w:r>
+      <w:r>
+        <w:t xml:space="preserve"> – One codebase tracked in version control, many deploys.</w:t>
+      </w:r>
+    </w:p>
+    <w:p>
+      <w:pPr>
+        <w:numPr>
+          <w:ilvl w:val="0"/>
+          <w:numId w:val="31"/>
+        </w:numPr>
+        <w:tabs>
+          <w:tab w:val="num" w:pos="720"/>
+        </w:tabs>
+      </w:pPr>
+      <w:r>
+        <w:rPr>
+          <w:b/>
+          <w:bCs/>
+        </w:rPr>
+        <w:t>Dependencies</w:t>
+      </w:r>
+      <w:r>
+        <w:t xml:space="preserve"> – Explicitly declare and isolate dependencies.</w:t>
+      </w:r>
+    </w:p>
+    <w:p>
+      <w:pPr>
+        <w:numPr>
+          <w:ilvl w:val="0"/>
+          <w:numId w:val="31"/>
+        </w:numPr>
+        <w:tabs>
+          <w:tab w:val="num" w:pos="720"/>
+        </w:tabs>
+      </w:pPr>
+      <w:r>
+        <w:rPr>
+          <w:b/>
+          <w:bCs/>
+        </w:rPr>
+        <w:t>Config</w:t>
+      </w:r>
+      <w:r>
+        <w:t xml:space="preserve"> – Store configuration in the environment, not in code.</w:t>
+      </w:r>
+    </w:p>
+    <w:p>
+      <w:pPr>
+        <w:numPr>
+          <w:ilvl w:val="0"/>
+          <w:numId w:val="31"/>
+        </w:numPr>
+        <w:tabs>
+          <w:tab w:val="num" w:pos="720"/>
+        </w:tabs>
+      </w:pPr>
+      <w:r>
+        <w:rPr>
+          <w:b/>
+          <w:bCs/>
+        </w:rPr>
+        <w:t>Backing Services</w:t>
+      </w:r>
+      <w:r>
+        <w:t xml:space="preserve"> – Treat backing services (databases, caches, queues) as attached resources.</w:t>
+      </w:r>
+    </w:p>
+    <w:p>
+      <w:pPr>
+        <w:numPr>
+          <w:ilvl w:val="0"/>
+          <w:numId w:val="31"/>
+        </w:numPr>
+        <w:tabs>
+          <w:tab w:val="num" w:pos="720"/>
+        </w:tabs>
+      </w:pPr>
+      <w:r>
+        <w:rPr>
+          <w:b/>
+          <w:bCs/>
+        </w:rPr>
+        <w:t xml:space="preserve">Build, Release, </w:t>
+      </w:r>
+      <w:r>
+        <w:rPr>
+          <w:b/>
+          <w:bCs/>
+        </w:rPr>
+        <w:t>run</w:t>
+      </w:r>
+      <w:r>
+        <w:t xml:space="preserve"> – Strictly separate the build, release, and run stages.</w:t>
+      </w:r>
+    </w:p>
+    <w:p>
+      <w:pPr>
+        <w:numPr>
+          <w:ilvl w:val="0"/>
+          <w:numId w:val="31"/>
+        </w:numPr>
+        <w:tabs>
+          <w:tab w:val="num" w:pos="720"/>
+        </w:tabs>
+      </w:pPr>
+      <w:r>
+        <w:rPr>
+          <w:b/>
+          <w:bCs/>
+        </w:rPr>
+        <w:t>Processes</w:t>
+      </w:r>
+      <w:r>
+        <w:t xml:space="preserve"> – Execute the app as one or more stateless processes.</w:t>
+      </w:r>
+    </w:p>
+    <w:p>
+      <w:pPr>
+        <w:numPr>
+          <w:ilvl w:val="0"/>
+          <w:numId w:val="31"/>
+        </w:numPr>
+        <w:tabs>
+          <w:tab w:val="num" w:pos="720"/>
+        </w:tabs>
+      </w:pPr>
+      <w:r>
+        <w:rPr>
+          <w:b/>
+          <w:bCs/>
+        </w:rPr>
+        <w:t>Port Binding</w:t>
+      </w:r>
+      <w:r>
+        <w:t xml:space="preserve"> – Export services via port binding (self-contained service).</w:t>
+      </w:r>
+    </w:p>
+    <w:p>
+      <w:pPr>
+        <w:numPr>
+          <w:ilvl w:val="0"/>
+          <w:numId w:val="31"/>
+        </w:numPr>
+        <w:tabs>
+          <w:tab w:val="num" w:pos="720"/>
+        </w:tabs>
+      </w:pPr>
+      <w:r>
+        <w:rPr>
+          <w:b/>
+          <w:bCs/>
+        </w:rPr>
+        <w:t>Concurrency</w:t>
+      </w:r>
+      <w:r>
+        <w:t xml:space="preserve"> – Scale out via the process model.</w:t>
+      </w:r>
+    </w:p>
+    <w:p>
+      <w:pPr>
+        <w:numPr>
+          <w:ilvl w:val="0"/>
+          <w:numId w:val="31"/>
+        </w:numPr>
+        <w:tabs>
+          <w:tab w:val="num" w:pos="720"/>
+        </w:tabs>
+      </w:pPr>
+      <w:r>
+        <w:rPr>
+          <w:b/>
+          <w:bCs/>
+        </w:rPr>
+        <w:t>Disposability</w:t>
+      </w:r>
+      <w:r>
+        <w:t xml:space="preserve"> – Fast startup and graceful shutdown for robust scaling and deployment.</w:t>
+      </w:r>
+    </w:p>
+    <w:p>
+      <w:pPr>
+        <w:numPr>
+          <w:ilvl w:val="0"/>
+          <w:numId w:val="31"/>
+        </w:numPr>
+        <w:tabs>
+          <w:tab w:val="num" w:pos="720"/>
+        </w:tabs>
+      </w:pPr>
+      <w:r>
+        <w:rPr>
+          <w:b/>
+          <w:bCs/>
+        </w:rPr>
+        <w:t>Dev/Prod Parity</w:t>
+      </w:r>
+      <w:r>
+        <w:t xml:space="preserve"> – Keep development, staging, and production as similar as possible.</w:t>
+      </w:r>
+    </w:p>
+    <w:p>
+      <w:pPr>
+        <w:numPr>
+          <w:ilvl w:val="0"/>
+          <w:numId w:val="31"/>
+        </w:numPr>
+        <w:tabs>
+          <w:tab w:val="num" w:pos="720"/>
+        </w:tabs>
+      </w:pPr>
+      <w:r>
+        <w:rPr>
+          <w:b/>
+          <w:bCs/>
+        </w:rPr>
+        <w:t>Logs</w:t>
+      </w:r>
+      <w:r>
+        <w:t xml:space="preserve"> – Treat logs as event streams, output to STDOUT/STDERR.</w:t>
+      </w:r>
+    </w:p>
+    <w:p>
+      <w:pPr>
+        <w:numPr>
+          <w:ilvl w:val="0"/>
+          <w:numId w:val="31"/>
+        </w:numPr>
+        <w:tabs>
+          <w:tab w:val="num" w:pos="720"/>
+        </w:tabs>
+      </w:pPr>
+      <w:r>
+        <w:rPr>
+          <w:b/>
+          <w:bCs/>
+        </w:rPr>
+        <w:t>Admin Processes</w:t>
+      </w:r>
+      <w:r>
+        <w:t xml:space="preserve"> – Run admin/maintenance tasks as one-off processes.</w:t>
+      </w:r>
+    </w:p>
+    <w:p>
+      <w:pPr>
+        <w:ind w:left="720"/>
+      </w:pPr>
+      <w:r>
+        <w:t>Resources</w:t>
+      </w:r>
+      <w:r>
+        <w:t xml:space="preserve">: </w:t>
+      </w:r>
+      <w:hyperlink r:id="rId17" w:history="1">
+        <w:r>
+          <w:rPr>
+            <w:rStyle w:val="Hyperlink"/>
+          </w:rPr>
+          <w:t>https://www.geeksforgeeks.org/blogs/what-is-twelve-factor-app/</w:t>
+        </w:r>
+      </w:hyperlink>
+    </w:p>
+    <w:p/>
+    <w:p/>
     <w:sectPr>
       <w:pgSz w:w="11906" w:h="16838"/>
       <w:pgMar w:top="720" w:right="720" w:bottom="720" w:left="720" w:header="708" w:footer="708" w:gutter="0"/>
@@ -8268,6 +9646,155 @@
     </w:lvl>
   </w:abstractNum>
   <w:abstractNum w:abstractNumId="6" w15:restartNumberingAfterBreak="0">
+    <w:nsid w:val="23E83759"/>
+    <w:multiLevelType w:val="multilevel"/>
+    <w:tmpl w:val="3D508B3A"/>
+    <w:lvl w:ilvl="0">
+      <w:start w:val="1"/>
+      <w:numFmt w:val="bullet"/>
+      <w:lvlText w:val=""/>
+      <w:lvlJc w:val="left"/>
+      <w:pPr>
+        <w:tabs>
+          <w:tab w:val="num" w:pos="1080"/>
+        </w:tabs>
+        <w:ind w:left="1080" w:hanging="360"/>
+      </w:pPr>
+      <w:rPr>
+        <w:rFonts w:ascii="Symbol" w:hAnsi="Symbol" w:hint="default"/>
+        <w:sz w:val="20"/>
+      </w:rPr>
+    </w:lvl>
+    <w:lvl w:ilvl="1" w:tentative="1">
+      <w:start w:val="1"/>
+      <w:numFmt w:val="bullet"/>
+      <w:lvlText w:val="o"/>
+      <w:lvlJc w:val="left"/>
+      <w:pPr>
+        <w:tabs>
+          <w:tab w:val="num" w:pos="1800"/>
+        </w:tabs>
+        <w:ind w:left="1800" w:hanging="360"/>
+      </w:pPr>
+      <w:rPr>
+        <w:rFonts w:ascii="Courier New" w:hAnsi="Courier New" w:hint="default"/>
+        <w:sz w:val="20"/>
+      </w:rPr>
+    </w:lvl>
+    <w:lvl w:ilvl="2" w:tentative="1">
+      <w:start w:val="1"/>
+      <w:numFmt w:val="bullet"/>
+      <w:lvlText w:val=""/>
+      <w:lvlJc w:val="left"/>
+      <w:pPr>
+        <w:tabs>
+          <w:tab w:val="num" w:pos="2520"/>
+        </w:tabs>
+        <w:ind w:left="2520" w:hanging="360"/>
+      </w:pPr>
+      <w:rPr>
+        <w:rFonts w:ascii="Wingdings" w:hAnsi="Wingdings" w:hint="default"/>
+        <w:sz w:val="20"/>
+      </w:rPr>
+    </w:lvl>
+    <w:lvl w:ilvl="3" w:tentative="1">
+      <w:start w:val="1"/>
+      <w:numFmt w:val="bullet"/>
+      <w:lvlText w:val=""/>
+      <w:lvlJc w:val="left"/>
+      <w:pPr>
+        <w:tabs>
+          <w:tab w:val="num" w:pos="3240"/>
+        </w:tabs>
+        <w:ind w:left="3240" w:hanging="360"/>
+      </w:pPr>
+      <w:rPr>
+        <w:rFonts w:ascii="Wingdings" w:hAnsi="Wingdings" w:hint="default"/>
+        <w:sz w:val="20"/>
+      </w:rPr>
+    </w:lvl>
+    <w:lvl w:ilvl="4" w:tentative="1">
+      <w:start w:val="1"/>
+      <w:numFmt w:val="bullet"/>
+      <w:lvlText w:val=""/>
+      <w:lvlJc w:val="left"/>
+      <w:pPr>
+        <w:tabs>
+          <w:tab w:val="num" w:pos="3960"/>
+        </w:tabs>
+        <w:ind w:left="3960" w:hanging="360"/>
+      </w:pPr>
+      <w:rPr>
+        <w:rFonts w:ascii="Wingdings" w:hAnsi="Wingdings" w:hint="default"/>
+        <w:sz w:val="20"/>
+      </w:rPr>
+    </w:lvl>
+    <w:lvl w:ilvl="5" w:tentative="1">
+      <w:start w:val="1"/>
+      <w:numFmt w:val="bullet"/>
+      <w:lvlText w:val=""/>
+      <w:lvlJc w:val="left"/>
+      <w:pPr>
+        <w:tabs>
+          <w:tab w:val="num" w:pos="4680"/>
+        </w:tabs>
+        <w:ind w:left="4680" w:hanging="360"/>
+      </w:pPr>
+      <w:rPr>
+        <w:rFonts w:ascii="Wingdings" w:hAnsi="Wingdings" w:hint="default"/>
+        <w:sz w:val="20"/>
+      </w:rPr>
+    </w:lvl>
+    <w:lvl w:ilvl="6" w:tentative="1">
+      <w:start w:val="1"/>
+      <w:numFmt w:val="bullet"/>
+      <w:lvlText w:val=""/>
+      <w:lvlJc w:val="left"/>
+      <w:pPr>
+        <w:tabs>
+          <w:tab w:val="num" w:pos="5400"/>
+        </w:tabs>
+        <w:ind w:left="5400" w:hanging="360"/>
+      </w:pPr>
+      <w:rPr>
+        <w:rFonts w:ascii="Wingdings" w:hAnsi="Wingdings" w:hint="default"/>
+        <w:sz w:val="20"/>
+      </w:rPr>
+    </w:lvl>
+    <w:lvl w:ilvl="7" w:tentative="1">
+      <w:start w:val="1"/>
+      <w:numFmt w:val="bullet"/>
+      <w:lvlText w:val=""/>
+      <w:lvlJc w:val="left"/>
+      <w:pPr>
+        <w:tabs>
+          <w:tab w:val="num" w:pos="6120"/>
+        </w:tabs>
+        <w:ind w:left="6120" w:hanging="360"/>
+      </w:pPr>
+      <w:rPr>
+        <w:rFonts w:ascii="Wingdings" w:hAnsi="Wingdings" w:hint="default"/>
+        <w:sz w:val="20"/>
+      </w:rPr>
+    </w:lvl>
+    <w:lvl w:ilvl="8" w:tentative="1">
+      <w:start w:val="1"/>
+      <w:numFmt w:val="bullet"/>
+      <w:lvlText w:val=""/>
+      <w:lvlJc w:val="left"/>
+      <w:pPr>
+        <w:tabs>
+          <w:tab w:val="num" w:pos="6840"/>
+        </w:tabs>
+        <w:ind w:left="6840" w:hanging="360"/>
+      </w:pPr>
+      <w:rPr>
+        <w:rFonts w:ascii="Wingdings" w:hAnsi="Wingdings" w:hint="default"/>
+        <w:sz w:val="20"/>
+      </w:rPr>
+    </w:lvl>
+  </w:abstractNum>
+  <w:abstractNum w:abstractNumId="7" w15:restartNumberingAfterBreak="0">
     <w:nsid w:val="260D0439"/>
     <w:multiLevelType w:val="multilevel"/>
     <w:tmpl w:val="6CC0992E"/>
@@ -8416,7 +9943,7 @@
       </w:rPr>
     </w:lvl>
   </w:abstractNum>
-  <w:abstractNum w:abstractNumId="7" w15:restartNumberingAfterBreak="0">
+  <w:abstractNum w:abstractNumId="8" w15:restartNumberingAfterBreak="0">
     <w:nsid w:val="28601A6B"/>
     <w:multiLevelType w:val="multilevel"/>
     <w:tmpl w:val="3CAAAEB8"/>
@@ -8565,7 +10092,120 @@
       </w:rPr>
     </w:lvl>
   </w:abstractNum>
-  <w:abstractNum w:abstractNumId="8" w15:restartNumberingAfterBreak="0">
+  <w:abstractNum w:abstractNumId="9" w15:restartNumberingAfterBreak="0">
+    <w:nsid w:val="2AD849AB"/>
+    <w:multiLevelType w:val="multilevel"/>
+    <w:tmpl w:val="B6AA1792"/>
+    <w:lvl w:ilvl="0">
+      <w:start w:val="1"/>
+      <w:numFmt w:val="decimal"/>
+      <w:lvlText w:val="%1."/>
+      <w:lvlJc w:val="left"/>
+      <w:pPr>
+        <w:tabs>
+          <w:tab w:val="num" w:pos="1080"/>
+        </w:tabs>
+        <w:ind w:left="1080" w:hanging="360"/>
+      </w:pPr>
+    </w:lvl>
+    <w:lvl w:ilvl="1" w:tentative="1">
+      <w:start w:val="1"/>
+      <w:numFmt w:val="decimal"/>
+      <w:lvlText w:val="%2."/>
+      <w:lvlJc w:val="left"/>
+      <w:pPr>
+        <w:tabs>
+          <w:tab w:val="num" w:pos="1800"/>
+        </w:tabs>
+        <w:ind w:left="1800" w:hanging="360"/>
+      </w:pPr>
+    </w:lvl>
+    <w:lvl w:ilvl="2" w:tentative="1">
+      <w:start w:val="1"/>
+      <w:numFmt w:val="decimal"/>
+      <w:lvlText w:val="%3."/>
+      <w:lvlJc w:val="left"/>
+      <w:pPr>
+        <w:tabs>
+          <w:tab w:val="num" w:pos="2520"/>
+        </w:tabs>
+        <w:ind w:left="2520" w:hanging="360"/>
+      </w:pPr>
+    </w:lvl>
+    <w:lvl w:ilvl="3" w:tentative="1">
+      <w:start w:val="1"/>
+      <w:numFmt w:val="decimal"/>
+      <w:lvlText w:val="%4."/>
+      <w:lvlJc w:val="left"/>
+      <w:pPr>
+        <w:tabs>
+          <w:tab w:val="num" w:pos="3240"/>
+        </w:tabs>
+        <w:ind w:left="3240" w:hanging="360"/>
+      </w:pPr>
+    </w:lvl>
+    <w:lvl w:ilvl="4" w:tentative="1">
+      <w:start w:val="1"/>
+      <w:numFmt w:val="decimal"/>
+      <w:lvlText w:val="%5."/>
+      <w:lvlJc w:val="left"/>
+      <w:pPr>
+        <w:tabs>
+          <w:tab w:val="num" w:pos="3960"/>
+        </w:tabs>
+        <w:ind w:left="3960" w:hanging="360"/>
+      </w:pPr>
+    </w:lvl>
+    <w:lvl w:ilvl="5" w:tentative="1">
+      <w:start w:val="1"/>
+      <w:numFmt w:val="decimal"/>
+      <w:lvlText w:val="%6."/>
+      <w:lvlJc w:val="left"/>
+      <w:pPr>
+        <w:tabs>
+          <w:tab w:val="num" w:pos="4680"/>
+        </w:tabs>
+        <w:ind w:left="4680" w:hanging="360"/>
+      </w:pPr>
+    </w:lvl>
+    <w:lvl w:ilvl="6" w:tentative="1">
+      <w:start w:val="1"/>
+      <w:numFmt w:val="decimal"/>
+      <w:lvlText w:val="%7."/>
+      <w:lvlJc w:val="left"/>
+      <w:pPr>
+        <w:tabs>
+          <w:tab w:val="num" w:pos="5400"/>
+        </w:tabs>
+        <w:ind w:left="5400" w:hanging="360"/>
+      </w:pPr>
+    </w:lvl>
+    <w:lvl w:ilvl="7" w:tentative="1">
+      <w:start w:val="1"/>
+      <w:numFmt w:val="decimal"/>
+      <w:lvlText w:val="%8."/>
+      <w:lvlJc w:val="left"/>
+      <w:pPr>
+        <w:tabs>
+          <w:tab w:val="num" w:pos="6120"/>
+        </w:tabs>
+        <w:ind w:left="6120" w:hanging="360"/>
+      </w:pPr>
+    </w:lvl>
+    <w:lvl w:ilvl="8" w:tentative="1">
+      <w:start w:val="1"/>
+      <w:numFmt w:val="decimal"/>
+      <w:lvlText w:val="%9."/>
+      <w:lvlJc w:val="left"/>
+      <w:pPr>
+        <w:tabs>
+          <w:tab w:val="num" w:pos="6840"/>
+        </w:tabs>
+        <w:ind w:left="6840" w:hanging="360"/>
+      </w:pPr>
+    </w:lvl>
+  </w:abstractNum>
+  <w:abstractNum w:abstractNumId="10" w15:restartNumberingAfterBreak="0">
     <w:nsid w:val="2E7F086A"/>
     <w:multiLevelType w:val="multilevel"/>
     <w:tmpl w:val="0C849BE4"/>
@@ -8714,7 +10354,7 @@
       </w:rPr>
     </w:lvl>
   </w:abstractNum>
-  <w:abstractNum w:abstractNumId="9" w15:restartNumberingAfterBreak="0">
+  <w:abstractNum w:abstractNumId="11" w15:restartNumberingAfterBreak="0">
     <w:nsid w:val="31EF6A01"/>
     <w:multiLevelType w:val="multilevel"/>
     <w:tmpl w:val="DB9221EA"/>
@@ -8863,7 +10503,120 @@
       </w:rPr>
     </w:lvl>
   </w:abstractNum>
-  <w:abstractNum w:abstractNumId="10" w15:restartNumberingAfterBreak="0">
+  <w:abstractNum w:abstractNumId="12" w15:restartNumberingAfterBreak="0">
+    <w:nsid w:val="3252360D"/>
+    <w:multiLevelType w:val="hybridMultilevel"/>
+    <w:tmpl w:val="47D05E0C"/>
+    <w:lvl w:ilvl="0" w:tplc="FFFFFFFF">
+      <w:start w:val="1"/>
+      <w:numFmt w:val="decimal"/>
+      <w:lvlText w:val="%1."/>
+      <w:lvlJc w:val="left"/>
+      <w:pPr>
+        <w:ind w:left="720" w:hanging="360"/>
+      </w:pPr>
+      <w:rPr>
+        <w:rFonts w:hint="default"/>
+      </w:rPr>
+    </w:lvl>
+    <w:lvl w:ilvl="1" w:tplc="FFFFFFFF" w:tentative="1">
+      <w:start w:val="1"/>
+      <w:numFmt w:val="bullet"/>
+      <w:lvlText w:val="o"/>
+      <w:lvlJc w:val="left"/>
+      <w:pPr>
+        <w:ind w:left="1440" w:hanging="360"/>
+      </w:pPr>
+      <w:rPr>
+        <w:rFonts w:ascii="Courier New" w:hAnsi="Courier New" w:cs="Courier New" w:hint="default"/>
+      </w:rPr>
+    </w:lvl>
+    <w:lvl w:ilvl="2" w:tplc="FFFFFFFF" w:tentative="1">
+      <w:start w:val="1"/>
+      <w:numFmt w:val="bullet"/>
+      <w:lvlText w:val=""/>
+      <w:lvlJc w:val="left"/>
+      <w:pPr>
+        <w:ind w:left="2160" w:hanging="360"/>
+      </w:pPr>
+      <w:rPr>
+        <w:rFonts w:ascii="Wingdings" w:hAnsi="Wingdings" w:hint="default"/>
+      </w:rPr>
+    </w:lvl>
+    <w:lvl w:ilvl="3" w:tplc="FFFFFFFF" w:tentative="1">
+      <w:start w:val="1"/>
+      <w:numFmt w:val="bullet"/>
+      <w:lvlText w:val=""/>
+      <w:lvlJc w:val="left"/>
+      <w:pPr>
+        <w:ind w:left="2880" w:hanging="360"/>
+      </w:pPr>
+      <w:rPr>
+        <w:rFonts w:ascii="Symbol" w:hAnsi="Symbol" w:hint="default"/>
+      </w:rPr>
+    </w:lvl>
+    <w:lvl w:ilvl="4" w:tplc="FFFFFFFF" w:tentative="1">
+      <w:start w:val="1"/>
+      <w:numFmt w:val="bullet"/>
+      <w:lvlText w:val="o"/>
+      <w:lvlJc w:val="left"/>
+      <w:pPr>
+        <w:ind w:left="3600" w:hanging="360"/>
+      </w:pPr>
+      <w:rPr>
+        <w:rFonts w:ascii="Courier New" w:hAnsi="Courier New" w:cs="Courier New" w:hint="default"/>
+      </w:rPr>
+    </w:lvl>
+    <w:lvl w:ilvl="5" w:tplc="FFFFFFFF" w:tentative="1">
+      <w:start w:val="1"/>
+      <w:numFmt w:val="bullet"/>
+      <w:lvlText w:val=""/>
+      <w:lvlJc w:val="left"/>
+      <w:pPr>
+        <w:ind w:left="4320" w:hanging="360"/>
+      </w:pPr>
+      <w:rPr>
+        <w:rFonts w:ascii="Wingdings" w:hAnsi="Wingdings" w:hint="default"/>
+      </w:rPr>
+    </w:lvl>
+    <w:lvl w:ilvl="6" w:tplc="FFFFFFFF" w:tentative="1">
+      <w:start w:val="1"/>
+      <w:numFmt w:val="bullet"/>
+      <w:lvlText w:val=""/>
+      <w:lvlJc w:val="left"/>
+      <w:pPr>
+        <w:ind w:left="5040" w:hanging="360"/>
+      </w:pPr>
+      <w:rPr>
+        <w:rFonts w:ascii="Symbol" w:hAnsi="Symbol" w:hint="default"/>
+      </w:rPr>
+    </w:lvl>
+    <w:lvl w:ilvl="7" w:tplc="FFFFFFFF" w:tentative="1">
+      <w:start w:val="1"/>
+      <w:numFmt w:val="bullet"/>
+      <w:lvlText w:val="o"/>
+      <w:lvlJc w:val="left"/>
+      <w:pPr>
+        <w:ind w:left="5760" w:hanging="360"/>
+      </w:pPr>
+      <w:rPr>
+        <w:rFonts w:ascii="Courier New" w:hAnsi="Courier New" w:cs="Courier New" w:hint="default"/>
+      </w:rPr>
+    </w:lvl>
+    <w:lvl w:ilvl="8" w:tplc="FFFFFFFF" w:tentative="1">
+      <w:start w:val="1"/>
+      <w:numFmt w:val="bullet"/>
+      <w:lvlText w:val=""/>
+      <w:lvlJc w:val="left"/>
+      <w:pPr>
+        <w:ind w:left="6480" w:hanging="360"/>
+      </w:pPr>
+      <w:rPr>
+        <w:rFonts w:ascii="Wingdings" w:hAnsi="Wingdings" w:hint="default"/>
+      </w:rPr>
+    </w:lvl>
+  </w:abstractNum>
+  <w:abstractNum w:abstractNumId="13" w15:restartNumberingAfterBreak="0">
     <w:nsid w:val="3F780FEA"/>
     <w:multiLevelType w:val="hybridMultilevel"/>
     <w:tmpl w:val="835AA728"/>
@@ -8949,7 +10702,7 @@
       </w:pPr>
     </w:lvl>
   </w:abstractNum>
-  <w:abstractNum w:abstractNumId="11" w15:restartNumberingAfterBreak="0">
+  <w:abstractNum w:abstractNumId="14" w15:restartNumberingAfterBreak="0">
     <w:nsid w:val="4BF23FF6"/>
     <w:multiLevelType w:val="multilevel"/>
     <w:tmpl w:val="12BE7908"/>
@@ -9098,7 +10851,7 @@
       </w:rPr>
     </w:lvl>
   </w:abstractNum>
-  <w:abstractNum w:abstractNumId="12" w15:restartNumberingAfterBreak="0">
+  <w:abstractNum w:abstractNumId="15" w15:restartNumberingAfterBreak="0">
     <w:nsid w:val="4C621A39"/>
     <w:multiLevelType w:val="hybridMultilevel"/>
     <w:tmpl w:val="56A698DC"/>
@@ -9211,7 +10964,7 @@
       </w:rPr>
     </w:lvl>
   </w:abstractNum>
-  <w:abstractNum w:abstractNumId="13" w15:restartNumberingAfterBreak="0">
+  <w:abstractNum w:abstractNumId="16" w15:restartNumberingAfterBreak="0">
     <w:nsid w:val="4F1221CF"/>
     <w:multiLevelType w:val="multilevel"/>
     <w:tmpl w:val="948E6F8C"/>
@@ -9360,7 +11113,7 @@
       </w:rPr>
     </w:lvl>
   </w:abstractNum>
-  <w:abstractNum w:abstractNumId="14" w15:restartNumberingAfterBreak="0">
+  <w:abstractNum w:abstractNumId="17" w15:restartNumberingAfterBreak="0">
     <w:nsid w:val="51877D1C"/>
     <w:multiLevelType w:val="multilevel"/>
     <w:tmpl w:val="F648D39A"/>
@@ -9509,7 +11262,120 @@
       </w:rPr>
     </w:lvl>
   </w:abstractNum>
-  <w:abstractNum w:abstractNumId="15" w15:restartNumberingAfterBreak="0">
+  <w:abstractNum w:abstractNumId="18" w15:restartNumberingAfterBreak="0">
+    <w:nsid w:val="53187A03"/>
+    <w:multiLevelType w:val="hybridMultilevel"/>
+    <w:tmpl w:val="47D05E0C"/>
+    <w:lvl w:ilvl="0" w:tplc="FFFFFFFF">
+      <w:start w:val="1"/>
+      <w:numFmt w:val="decimal"/>
+      <w:lvlText w:val="%1."/>
+      <w:lvlJc w:val="left"/>
+      <w:pPr>
+        <w:ind w:left="720" w:hanging="360"/>
+      </w:pPr>
+      <w:rPr>
+        <w:rFonts w:hint="default"/>
+      </w:rPr>
+    </w:lvl>
+    <w:lvl w:ilvl="1" w:tplc="FFFFFFFF" w:tentative="1">
+      <w:start w:val="1"/>
+      <w:numFmt w:val="bullet"/>
+      <w:lvlText w:val="o"/>
+      <w:lvlJc w:val="left"/>
+      <w:pPr>
+        <w:ind w:left="1440" w:hanging="360"/>
+      </w:pPr>
+      <w:rPr>
+        <w:rFonts w:ascii="Courier New" w:hAnsi="Courier New" w:cs="Courier New" w:hint="default"/>
+      </w:rPr>
+    </w:lvl>
+    <w:lvl w:ilvl="2" w:tplc="FFFFFFFF" w:tentative="1">
+      <w:start w:val="1"/>
+      <w:numFmt w:val="bullet"/>
+      <w:lvlText w:val=""/>
+      <w:lvlJc w:val="left"/>
+      <w:pPr>
+        <w:ind w:left="2160" w:hanging="360"/>
+      </w:pPr>
+      <w:rPr>
+        <w:rFonts w:ascii="Wingdings" w:hAnsi="Wingdings" w:hint="default"/>
+      </w:rPr>
+    </w:lvl>
+    <w:lvl w:ilvl="3" w:tplc="FFFFFFFF" w:tentative="1">
+      <w:start w:val="1"/>
+      <w:numFmt w:val="bullet"/>
+      <w:lvlText w:val=""/>
+      <w:lvlJc w:val="left"/>
+      <w:pPr>
+        <w:ind w:left="2880" w:hanging="360"/>
+      </w:pPr>
+      <w:rPr>
+        <w:rFonts w:ascii="Symbol" w:hAnsi="Symbol" w:hint="default"/>
+      </w:rPr>
+    </w:lvl>
+    <w:lvl w:ilvl="4" w:tplc="FFFFFFFF" w:tentative="1">
+      <w:start w:val="1"/>
+      <w:numFmt w:val="bullet"/>
+      <w:lvlText w:val="o"/>
+      <w:lvlJc w:val="left"/>
+      <w:pPr>
+        <w:ind w:left="3600" w:hanging="360"/>
+      </w:pPr>
+      <w:rPr>
+        <w:rFonts w:ascii="Courier New" w:hAnsi="Courier New" w:cs="Courier New" w:hint="default"/>
+      </w:rPr>
+    </w:lvl>
+    <w:lvl w:ilvl="5" w:tplc="FFFFFFFF" w:tentative="1">
+      <w:start w:val="1"/>
+      <w:numFmt w:val="bullet"/>
+      <w:lvlText w:val=""/>
+      <w:lvlJc w:val="left"/>
+      <w:pPr>
+        <w:ind w:left="4320" w:hanging="360"/>
+      </w:pPr>
+      <w:rPr>
+        <w:rFonts w:ascii="Wingdings" w:hAnsi="Wingdings" w:hint="default"/>
+      </w:rPr>
+    </w:lvl>
+    <w:lvl w:ilvl="6" w:tplc="FFFFFFFF" w:tentative="1">
+      <w:start w:val="1"/>
+      <w:numFmt w:val="bullet"/>
+      <w:lvlText w:val=""/>
+      <w:lvlJc w:val="left"/>
+      <w:pPr>
+        <w:ind w:left="5040" w:hanging="360"/>
+      </w:pPr>
+      <w:rPr>
+        <w:rFonts w:ascii="Symbol" w:hAnsi="Symbol" w:hint="default"/>
+      </w:rPr>
+    </w:lvl>
+    <w:lvl w:ilvl="7" w:tplc="FFFFFFFF" w:tentative="1">
+      <w:start w:val="1"/>
+      <w:numFmt w:val="bullet"/>
+      <w:lvlText w:val="o"/>
+      <w:lvlJc w:val="left"/>
+      <w:pPr>
+        <w:ind w:left="5760" w:hanging="360"/>
+      </w:pPr>
+      <w:rPr>
+        <w:rFonts w:ascii="Courier New" w:hAnsi="Courier New" w:cs="Courier New" w:hint="default"/>
+      </w:rPr>
+    </w:lvl>
+    <w:lvl w:ilvl="8" w:tplc="FFFFFFFF" w:tentative="1">
+      <w:start w:val="1"/>
+      <w:numFmt w:val="bullet"/>
+      <w:lvlText w:val=""/>
+      <w:lvlJc w:val="left"/>
+      <w:pPr>
+        <w:ind w:left="6480" w:hanging="360"/>
+      </w:pPr>
+      <w:rPr>
+        <w:rFonts w:ascii="Wingdings" w:hAnsi="Wingdings" w:hint="default"/>
+      </w:rPr>
+    </w:lvl>
+  </w:abstractNum>
+  <w:abstractNum w:abstractNumId="19" w15:restartNumberingAfterBreak="0">
     <w:nsid w:val="53B502E9"/>
     <w:multiLevelType w:val="multilevel"/>
     <w:tmpl w:val="91CA9050"/>
@@ -9658,7 +11524,7 @@
       </w:rPr>
     </w:lvl>
   </w:abstractNum>
-  <w:abstractNum w:abstractNumId="16" w15:restartNumberingAfterBreak="0">
+  <w:abstractNum w:abstractNumId="20" w15:restartNumberingAfterBreak="0">
     <w:nsid w:val="558A455A"/>
     <w:multiLevelType w:val="multilevel"/>
     <w:tmpl w:val="BB0AE356"/>
@@ -9807,7 +11673,7 @@
       </w:rPr>
     </w:lvl>
   </w:abstractNum>
-  <w:abstractNum w:abstractNumId="17" w15:restartNumberingAfterBreak="0">
+  <w:abstractNum w:abstractNumId="21" w15:restartNumberingAfterBreak="0">
     <w:nsid w:val="563867E9"/>
     <w:multiLevelType w:val="multilevel"/>
     <w:tmpl w:val="5BB811B6"/>
@@ -9956,7 +11822,7 @@
       </w:rPr>
     </w:lvl>
   </w:abstractNum>
-  <w:abstractNum w:abstractNumId="18" w15:restartNumberingAfterBreak="0">
+  <w:abstractNum w:abstractNumId="22" w15:restartNumberingAfterBreak="0">
     <w:nsid w:val="5E873AC0"/>
     <w:multiLevelType w:val="multilevel"/>
     <w:tmpl w:val="0D6A0EC4"/>
@@ -10105,7 +11971,7 @@
       </w:rPr>
     </w:lvl>
   </w:abstractNum>
-  <w:abstractNum w:abstractNumId="19" w15:restartNumberingAfterBreak="0">
+  <w:abstractNum w:abstractNumId="23" w15:restartNumberingAfterBreak="0">
     <w:nsid w:val="699709C8"/>
     <w:multiLevelType w:val="multilevel"/>
     <w:tmpl w:val="F2A2CD08"/>
@@ -10254,10 +12120,10 @@
       </w:rPr>
     </w:lvl>
   </w:abstractNum>
-  <w:abstractNum w:abstractNumId="20" w15:restartNumberingAfterBreak="0">
+  <w:abstractNum w:abstractNumId="24" w15:restartNumberingAfterBreak="0">
     <w:nsid w:val="6AED639C"/>
     <w:multiLevelType w:val="hybridMultilevel"/>
-    <w:tmpl w:val="47D05E0C"/>
+    <w:tmpl w:val="68E6B242"/>
     <w:lvl w:ilvl="0" w:tplc="4009000F">
       <w:start w:val="1"/>
       <w:numFmt w:val="decimal"/>
@@ -10367,7 +12233,7 @@
       </w:rPr>
     </w:lvl>
   </w:abstractNum>
-  <w:abstractNum w:abstractNumId="21" w15:restartNumberingAfterBreak="0">
+  <w:abstractNum w:abstractNumId="25" w15:restartNumberingAfterBreak="0">
     <w:nsid w:val="70763E57"/>
     <w:multiLevelType w:val="multilevel"/>
     <w:tmpl w:val="828E091E"/>
@@ -10516,7 +12382,7 @@
       </w:rPr>
     </w:lvl>
   </w:abstractNum>
-  <w:abstractNum w:abstractNumId="22" w15:restartNumberingAfterBreak="0">
+  <w:abstractNum w:abstractNumId="26" w15:restartNumberingAfterBreak="0">
     <w:nsid w:val="70FF3FF9"/>
     <w:multiLevelType w:val="hybridMultilevel"/>
     <w:tmpl w:val="A45A81E6"/>
@@ -10605,7 +12471,7 @@
       </w:pPr>
     </w:lvl>
   </w:abstractNum>
-  <w:abstractNum w:abstractNumId="23" w15:restartNumberingAfterBreak="0">
+  <w:abstractNum w:abstractNumId="27" w15:restartNumberingAfterBreak="0">
     <w:nsid w:val="769051EB"/>
     <w:multiLevelType w:val="hybridMultilevel"/>
     <w:tmpl w:val="BA7E0DE0"/>
@@ -10719,79 +12585,79 @@
     </w:lvl>
   </w:abstractNum>
   <w:num w:numId="1" w16cid:durableId="1771001347">
-    <w:abstractNumId w:val="20"/>
+    <w:abstractNumId w:val="24"/>
   </w:num>
   <w:num w:numId="2" w16cid:durableId="421990468">
-    <w:abstractNumId w:val="10"/>
+    <w:abstractNumId w:val="13"/>
   </w:num>
   <w:num w:numId="3" w16cid:durableId="718475216">
-    <w:abstractNumId w:val="12"/>
+    <w:abstractNumId w:val="15"/>
   </w:num>
   <w:num w:numId="4" w16cid:durableId="1561749717">
-    <w:abstractNumId w:val="23"/>
+    <w:abstractNumId w:val="27"/>
   </w:num>
   <w:num w:numId="5" w16cid:durableId="751896595">
-    <w:abstractNumId w:val="14"/>
+    <w:abstractNumId w:val="17"/>
   </w:num>
   <w:num w:numId="6" w16cid:durableId="1727409014">
-    <w:abstractNumId w:val="22"/>
+    <w:abstractNumId w:val="26"/>
   </w:num>
   <w:num w:numId="7" w16cid:durableId="1661808372">
-    <w:abstractNumId w:val="6"/>
+    <w:abstractNumId w:val="7"/>
     <w:lvlOverride w:ilvl="0">
       <w:startOverride w:val="1"/>
     </w:lvlOverride>
   </w:num>
   <w:num w:numId="8" w16cid:durableId="1357727636">
-    <w:abstractNumId w:val="6"/>
+    <w:abstractNumId w:val="7"/>
     <w:lvlOverride w:ilvl="0">
       <w:startOverride w:val="2"/>
     </w:lvlOverride>
   </w:num>
   <w:num w:numId="9" w16cid:durableId="211890184">
-    <w:abstractNumId w:val="6"/>
+    <w:abstractNumId w:val="7"/>
     <w:lvlOverride w:ilvl="0">
       <w:startOverride w:val="3"/>
     </w:lvlOverride>
   </w:num>
   <w:num w:numId="10" w16cid:durableId="20517649">
-    <w:abstractNumId w:val="6"/>
+    <w:abstractNumId w:val="7"/>
     <w:lvlOverride w:ilvl="0">
       <w:startOverride w:val="4"/>
     </w:lvlOverride>
   </w:num>
   <w:num w:numId="11" w16cid:durableId="605969487">
-    <w:abstractNumId w:val="19"/>
+    <w:abstractNumId w:val="23"/>
   </w:num>
   <w:num w:numId="12" w16cid:durableId="1246106947">
     <w:abstractNumId w:val="2"/>
   </w:num>
   <w:num w:numId="13" w16cid:durableId="651325251">
-    <w:abstractNumId w:val="7"/>
+    <w:abstractNumId w:val="8"/>
   </w:num>
   <w:num w:numId="14" w16cid:durableId="261424288">
-    <w:abstractNumId w:val="8"/>
+    <w:abstractNumId w:val="10"/>
   </w:num>
   <w:num w:numId="15" w16cid:durableId="472017035">
     <w:abstractNumId w:val="4"/>
   </w:num>
   <w:num w:numId="16" w16cid:durableId="1695379017">
-    <w:abstractNumId w:val="17"/>
+    <w:abstractNumId w:val="21"/>
   </w:num>
   <w:num w:numId="17" w16cid:durableId="785195105">
-    <w:abstractNumId w:val="9"/>
+    <w:abstractNumId w:val="11"/>
   </w:num>
   <w:num w:numId="18" w16cid:durableId="900798302">
     <w:abstractNumId w:val="1"/>
   </w:num>
   <w:num w:numId="19" w16cid:durableId="1861695634">
-    <w:abstractNumId w:val="15"/>
+    <w:abstractNumId w:val="19"/>
   </w:num>
   <w:num w:numId="20" w16cid:durableId="139543151">
     <w:abstractNumId w:val="0"/>
   </w:num>
   <w:num w:numId="21" w16cid:durableId="1771848141">
-    <w:abstractNumId w:val="13"/>
+    <w:abstractNumId w:val="16"/>
   </w:num>
   <w:num w:numId="22" w16cid:durableId="748187736">
     <w:abstractNumId w:val="3"/>
@@ -10800,16 +12666,28 @@
     <w:abstractNumId w:val="5"/>
   </w:num>
   <w:num w:numId="24" w16cid:durableId="1478767357">
+    <w:abstractNumId w:val="22"/>
+  </w:num>
+  <w:num w:numId="25" w16cid:durableId="1635672842">
+    <w:abstractNumId w:val="14"/>
+  </w:num>
+  <w:num w:numId="26" w16cid:durableId="1859387441">
+    <w:abstractNumId w:val="20"/>
+  </w:num>
+  <w:num w:numId="27" w16cid:durableId="2124228114">
+    <w:abstractNumId w:val="25"/>
+  </w:num>
+  <w:num w:numId="28" w16cid:durableId="1818692123">
+    <w:abstractNumId w:val="6"/>
+  </w:num>
+  <w:num w:numId="29" w16cid:durableId="238057174">
     <w:abstractNumId w:val="18"/>
   </w:num>
-  <w:num w:numId="25" w16cid:durableId="1635672842">
-    <w:abstractNumId w:val="11"/>
+  <w:num w:numId="30" w16cid:durableId="1143741129">
+    <w:abstractNumId w:val="12"/>
   </w:num>
-  <w:num w:numId="26" w16cid:durableId="1859387441">
-    <w:abstractNumId w:val="16"/>
-  </w:num>
-  <w:num w:numId="27" w16cid:durableId="2124228114">
-    <w:abstractNumId w:val="21"/>
+  <w:num w:numId="31" w16cid:durableId="1188640808">
+    <w:abstractNumId w:val="9"/>
   </w:num>
 </w:numbering>
 </file>
@@ -11911,6 +13789,44 @@
       <w:szCs w:val="20"/>
     </w:rPr>
   </w:style>
+  <w:style w:type="table" w:styleId="TableGrid">
+    <w:name w:val="Table Grid"/>
+    <w:basedOn w:val="TableNormal"/>
+    <w:uiPriority w:val="39"/>
+    <w:rsid w:val="005600C8"/>
+    <w:pPr>
+      <w:spacing w:after="0" w:line="240" w:lineRule="auto"/>
+    </w:pPr>
+    <w:tblPr>
+      <w:tblBorders>
+        <w:top w:val="single" w:sz="4" w:space="0" w:color="auto"/>
+        <w:left w:val="single" w:sz="4" w:space="0" w:color="auto"/>
+        <w:bottom w:val="single" w:sz="4" w:space="0" w:color="auto"/>
+        <w:right w:val="single" w:sz="4" w:space="0" w:color="auto"/>
+        <w:insideH w:val="single" w:sz="4" w:space="0" w:color="auto"/>
+        <w:insideV w:val="single" w:sz="4" w:space="0" w:color="auto"/>
+      </w:tblBorders>
+    </w:tblPr>
+  </w:style>
+  <w:style w:type="table" w:styleId="TableGridLight">
+    <w:name w:val="Grid Table Light"/>
+    <w:basedOn w:val="TableNormal"/>
+    <w:uiPriority w:val="40"/>
+    <w:rsid w:val="005600C8"/>
+    <w:pPr>
+      <w:spacing w:after="0" w:line="240" w:lineRule="auto"/>
+    </w:pPr>
+    <w:tblPr>
+      <w:tblBorders>
+        <w:top w:val="single" w:sz="4" w:space="0" w:color="BFBFBF" w:themeColor="background1" w:themeShade="BF"/>
+        <w:left w:val="single" w:sz="4" w:space="0" w:color="BFBFBF" w:themeColor="background1" w:themeShade="BF"/>
+        <w:bottom w:val="single" w:sz="4" w:space="0" w:color="BFBFBF" w:themeColor="background1" w:themeShade="BF"/>
+        <w:right w:val="single" w:sz="4" w:space="0" w:color="BFBFBF" w:themeColor="background1" w:themeShade="BF"/>
+        <w:insideH w:val="single" w:sz="4" w:space="0" w:color="BFBFBF" w:themeColor="background1" w:themeShade="BF"/>
+        <w:insideV w:val="single" w:sz="4" w:space="0" w:color="BFBFBF" w:themeColor="background1" w:themeShade="BF"/>
+      </w:tblBorders>
+    </w:tblPr>
+  </w:style>
 </w:styles>
 </file>
 

</xml_diff>